<commit_message>
feat(2A): bang ds_nganh 4 cot cho PLI_M03/M04/M05 (TNHH 2TV+, CTCP, HD) - cung cau truc voi PLI_M01, drop_until muc 5 tung mau
</commit_message>
<xml_diff>
--- a/app/templates/PLI_M03.docx
+++ b/app/templates/PLI_M03.docx
@@ -2070,85 +2070,227 @@
         <w:t xml:space="preserve">): </w:t>
       </w:r>
     </w:p>
-    <w:p>
-      <w:pPr>
-        <w:jc w:val="center"/>
-        <w:spacing w:before="120"/>
-      </w:pPr>
-      <w:r>
-        <w:rPr>
-          <w:rFonts w:ascii="Arial" w:hAnsi="Arial" w:cs="Arial"/>
-          <w:sz w:val="24"/>
-          <w:sz-cs w:val="24"/>
-          <w:b/>
-        </w:rPr>
-        <w:t xml:space="preserve">STT</w:t>
-      </w:r>
-    </w:p>
-    <w:p>
-      <w:pPr>
-        <w:jc w:val="center"/>
-        <w:spacing w:before="120"/>
-      </w:pPr>
-      <w:r>
-        <w:rPr>
-          <w:rFonts w:ascii="Arial" w:hAnsi="Arial" w:cs="Arial"/>
-          <w:sz w:val="24"/>
-          <w:sz-cs w:val="24"/>
-          <w:b/>
-        </w:rPr>
-        <w:t xml:space="preserve">Tên ngành</w:t>
-      </w:r>
-    </w:p>
-    <w:p>
-      <w:pPr>
-        <w:jc w:val="center"/>
-        <w:spacing w:before="120"/>
-      </w:pPr>
-      <w:r>
-        <w:rPr>
-          <w:rFonts w:ascii="Arial" w:hAnsi="Arial" w:cs="Arial"/>
-          <w:sz w:val="24"/>
-          <w:sz-cs w:val="24"/>
-          <w:b/>
-        </w:rPr>
-        <w:t xml:space="preserve">Mã ngành</w:t>
-      </w:r>
-    </w:p>
-    <w:p>
-      <w:pPr>
-        <w:jc w:val="center"/>
-        <w:spacing w:before="120"/>
-      </w:pPr>
-      <w:r>
-        <w:rPr>
-          <w:rFonts w:ascii="Arial" w:hAnsi="Arial" w:cs="Arial"/>
-          <w:sz w:val="24"/>
-          <w:sz-cs w:val="24"/>
-          <w:b/>
-        </w:rPr>
-        <w:t xml:space="preserve">Ngành, nghề kinh doanh chính (</w:t>
-      </w:r>
-      <w:r>
-        <w:rPr>
-          <w:rFonts w:ascii="Arial" w:hAnsi="Arial" w:cs="Arial"/>
-          <w:sz w:val="24"/>
-          <w:sz-cs w:val="24"/>
-          <w:b/>
-          <w:i/>
-        </w:rPr>
-        <w:t xml:space="preserve">đánh dấu X để chọn một trong các ngành, nghề đã kê khai</w:t>
-      </w:r>
-      <w:r>
-        <w:rPr>
-          <w:rFonts w:ascii="Arial" w:hAnsi="Arial" w:cs="Arial"/>
-          <w:sz w:val="24"/>
-          <w:sz-cs w:val="24"/>
-          <w:b/>
-        </w:rPr>
-        <w:t xml:space="preserve">)</w:t>
-      </w:r>
-    </w:p>
+    <w:tbl>
+      <w:tblPr>
+        <w:tblW w:type="auto" w:w="0"/>
+        <w:tblLook w:firstColumn="1" w:firstRow="1" w:lastColumn="0" w:lastRow="0" w:noHBand="0" w:noVBand="1" w:val="04A0"/>
+        <w:tblBorders>
+          <w:top w:val="single" w:sz="4" w:color="000000"/>
+          <w:left w:val="single" w:sz="4" w:color="000000"/>
+          <w:bottom w:val="single" w:sz="4" w:color="000000"/>
+          <w:right w:val="single" w:sz="4" w:color="000000"/>
+          <w:insideH w:val="single" w:sz="4" w:color="000000"/>
+          <w:insideV w:val="single" w:sz="4" w:color="000000"/>
+        </w:tblBorders>
+      </w:tblPr>
+      <w:tblGrid>
+        <w:gridCol w:w="2160"/>
+        <w:gridCol w:w="2160"/>
+        <w:gridCol w:w="2160"/>
+        <w:gridCol w:w="2160"/>
+      </w:tblGrid>
+      <w:tr>
+        <w:tc>
+          <w:tcPr>
+            <w:tcW w:type="dxa" w:w="2160"/>
+          </w:tcPr>
+          <w:p>
+            <w:r>
+              <w:rPr>
+                <w:b/>
+              </w:rPr>
+              <w:t>STT</w:t>
+            </w:r>
+          </w:p>
+        </w:tc>
+        <w:tc>
+          <w:tcPr>
+            <w:tcW w:type="dxa" w:w="2160"/>
+          </w:tcPr>
+          <w:p>
+            <w:r>
+              <w:rPr>
+                <w:b/>
+              </w:rPr>
+              <w:t>Tên ngành</w:t>
+            </w:r>
+          </w:p>
+        </w:tc>
+        <w:tc>
+          <w:tcPr>
+            <w:tcW w:type="dxa" w:w="2160"/>
+          </w:tcPr>
+          <w:p>
+            <w:r>
+              <w:rPr>
+                <w:b/>
+              </w:rPr>
+              <w:t>Mã ngành</w:t>
+            </w:r>
+          </w:p>
+        </w:tc>
+        <w:tc>
+          <w:tcPr>
+            <w:tcW w:type="dxa" w:w="2160"/>
+          </w:tcPr>
+          <w:p>
+            <w:r>
+              <w:rPr>
+                <w:b/>
+              </w:rPr>
+              <w:t>Ngành, nghề kinh doanh chính</w:t>
+            </w:r>
+          </w:p>
+        </w:tc>
+      </w:tr>
+      <w:tr>
+        <w:tc>
+          <w:tcPr>
+            <w:tcW w:type="dxa" w:w="2160"/>
+          </w:tcPr>
+          <w:p/>
+        </w:tc>
+        <w:tc>
+          <w:tcPr>
+            <w:tcW w:type="dxa" w:w="2160"/>
+          </w:tcPr>
+          <w:p/>
+        </w:tc>
+        <w:tc>
+          <w:tcPr>
+            <w:tcW w:type="dxa" w:w="2160"/>
+          </w:tcPr>
+          <w:p/>
+        </w:tc>
+        <w:tc>
+          <w:tcPr>
+            <w:tcW w:type="dxa" w:w="2160"/>
+          </w:tcPr>
+          <w:p/>
+        </w:tc>
+      </w:tr>
+      <w:tr>
+        <w:tc>
+          <w:tcPr>
+            <w:tcW w:type="dxa" w:w="2160"/>
+          </w:tcPr>
+          <w:p/>
+        </w:tc>
+        <w:tc>
+          <w:tcPr>
+            <w:tcW w:type="dxa" w:w="2160"/>
+          </w:tcPr>
+          <w:p/>
+        </w:tc>
+        <w:tc>
+          <w:tcPr>
+            <w:tcW w:type="dxa" w:w="2160"/>
+          </w:tcPr>
+          <w:p/>
+        </w:tc>
+        <w:tc>
+          <w:tcPr>
+            <w:tcW w:type="dxa" w:w="2160"/>
+          </w:tcPr>
+          <w:p/>
+        </w:tc>
+      </w:tr>
+      <w:tr>
+        <w:tc>
+          <w:tcPr>
+            <w:tcW w:type="dxa" w:w="2160"/>
+          </w:tcPr>
+          <w:p/>
+        </w:tc>
+        <w:tc>
+          <w:tcPr>
+            <w:tcW w:type="dxa" w:w="2160"/>
+          </w:tcPr>
+          <w:p/>
+        </w:tc>
+        <w:tc>
+          <w:tcPr>
+            <w:tcW w:type="dxa" w:w="2160"/>
+          </w:tcPr>
+          <w:p/>
+        </w:tc>
+        <w:tc>
+          <w:tcPr>
+            <w:tcW w:type="dxa" w:w="2160"/>
+          </w:tcPr>
+          <w:p/>
+        </w:tc>
+      </w:tr>
+      <w:tr>
+        <w:tc>
+          <w:tcPr>
+            <w:tcW w:type="dxa" w:w="2160"/>
+          </w:tcPr>
+          <w:p/>
+        </w:tc>
+        <w:tc>
+          <w:tcPr>
+            <w:tcW w:type="dxa" w:w="2160"/>
+          </w:tcPr>
+          <w:p/>
+        </w:tc>
+        <w:tc>
+          <w:tcPr>
+            <w:tcW w:type="dxa" w:w="2160"/>
+          </w:tcPr>
+          <w:p/>
+        </w:tc>
+        <w:tc>
+          <w:tcPr>
+            <w:tcW w:type="dxa" w:w="2160"/>
+          </w:tcPr>
+          <w:p/>
+        </w:tc>
+      </w:tr>
+      <w:tr>
+        <w:tc>
+          <w:tcPr>
+            <w:tcW w:type="dxa" w:w="2160"/>
+          </w:tcPr>
+          <w:p>
+            <w:r>
+              <w:t>{#ds_nganh}{_stt}</w:t>
+            </w:r>
+          </w:p>
+        </w:tc>
+        <w:tc>
+          <w:tcPr>
+            <w:tcW w:type="dxa" w:w="2160"/>
+          </w:tcPr>
+          <w:p>
+            <w:r>
+              <w:t>{ten_nganh}</w:t>
+            </w:r>
+          </w:p>
+        </w:tc>
+        <w:tc>
+          <w:tcPr>
+            <w:tcW w:type="dxa" w:w="2160"/>
+          </w:tcPr>
+          <w:p>
+            <w:r>
+              <w:t>{ma_nganh}</w:t>
+            </w:r>
+          </w:p>
+        </w:tc>
+        <w:tc>
+          <w:tcPr>
+            <w:tcW w:type="dxa" w:w="2160"/>
+          </w:tcPr>
+          <w:p>
+            <w:r>
+              <w:t>{la_nganh_chinh}{/ds_nganh}</w:t>
+            </w:r>
+          </w:p>
+        </w:tc>
+      </w:tr>
+    </w:tbl>
+    <w:p/>
     <w:p>
       <w:pPr>
         <w:jc w:val="center"/>
@@ -2630,6 +2772,192 @@
     </w:sectPr>
   </w:body>
 </w:document>
+</file>
+
+<file path=word/styles.xml><?xml version="1.0" encoding="utf-8"?>
+<w:styles xmlns:mc="http://schemas.openxmlformats.org/markup-compatibility/2006" xmlns:r="http://schemas.openxmlformats.org/officeDocument/2006/relationships" xmlns:w14="http://schemas.microsoft.com/office/word/2010/wordml" xmlns:w="http://schemas.openxmlformats.org/wordprocessingml/2006/main" mc:Ignorable="w14">
+  <w:docDefaults>
+    <w:rPrDefault>
+      <w:rPr>
+        <w:rFonts w:asciiTheme="minorHAnsi" w:eastAsiaTheme="minorEastAsia" w:hAnsiTheme="minorHAnsi" w:cstheme="minorBidi"/>
+        <w:sz w:val="24"/>
+        <w:szCs w:val="24"/>
+        <w:lang w:val="en-US" w:eastAsia="en-US" w:bidi="ar-SA"/>
+      </w:rPr>
+    </w:rPrDefault>
+    <w:pPrDefault/>
+  </w:docDefaults>
+  <w:latentStyles w:defLockedState="0" w:defUIPriority="99" w:defSemiHidden="1" w:defUnhideWhenUsed="1" w:defQFormat="0" w:count="276">
+    <w:lsdException w:name="Normal" w:semiHidden="0" w:uiPriority="0" w:unhideWhenUsed="0" w:qFormat="1"/>
+    <w:lsdException w:name="heading 1" w:semiHidden="0" w:uiPriority="9" w:unhideWhenUsed="0" w:qFormat="1"/>
+    <w:lsdException w:name="heading 2" w:uiPriority="9" w:qFormat="1"/>
+    <w:lsdException w:name="heading 3" w:uiPriority="9" w:qFormat="1"/>
+    <w:lsdException w:name="heading 4" w:uiPriority="9" w:qFormat="1"/>
+    <w:lsdException w:name="heading 5" w:uiPriority="9" w:qFormat="1"/>
+    <w:lsdException w:name="heading 6" w:uiPriority="9" w:qFormat="1"/>
+    <w:lsdException w:name="heading 7" w:uiPriority="9" w:qFormat="1"/>
+    <w:lsdException w:name="heading 8" w:uiPriority="9" w:qFormat="1"/>
+    <w:lsdException w:name="heading 9" w:uiPriority="9" w:qFormat="1"/>
+    <w:lsdException w:name="toc 1" w:uiPriority="39"/>
+    <w:lsdException w:name="toc 2" w:uiPriority="39"/>
+    <w:lsdException w:name="toc 3" w:uiPriority="39"/>
+    <w:lsdException w:name="toc 4" w:uiPriority="39"/>
+    <w:lsdException w:name="toc 5" w:uiPriority="39"/>
+    <w:lsdException w:name="toc 6" w:uiPriority="39"/>
+    <w:lsdException w:name="toc 7" w:uiPriority="39"/>
+    <w:lsdException w:name="toc 8" w:uiPriority="39"/>
+    <w:lsdException w:name="toc 9" w:uiPriority="39"/>
+    <w:lsdException w:name="caption" w:uiPriority="35" w:qFormat="1"/>
+    <w:lsdException w:name="Title" w:semiHidden="0" w:uiPriority="10" w:unhideWhenUsed="0" w:qFormat="1"/>
+    <w:lsdException w:name="Default Paragraph Font" w:uiPriority="1"/>
+    <w:lsdException w:name="Subtitle" w:semiHidden="0" w:uiPriority="11" w:unhideWhenUsed="0" w:qFormat="1"/>
+    <w:lsdException w:name="Strong" w:semiHidden="0" w:uiPriority="22" w:unhideWhenUsed="0" w:qFormat="1"/>
+    <w:lsdException w:name="Emphasis" w:semiHidden="0" w:uiPriority="20" w:unhideWhenUsed="0" w:qFormat="1"/>
+    <w:lsdException w:name="Table Grid" w:semiHidden="0" w:uiPriority="59" w:unhideWhenUsed="0"/>
+    <w:lsdException w:name="Placeholder Text" w:unhideWhenUsed="0"/>
+    <w:lsdException w:name="No Spacing" w:semiHidden="0" w:uiPriority="1" w:unhideWhenUsed="0" w:qFormat="1"/>
+    <w:lsdException w:name="Light Shading" w:semiHidden="0" w:uiPriority="60" w:unhideWhenUsed="0"/>
+    <w:lsdException w:name="Light List" w:semiHidden="0" w:uiPriority="61" w:unhideWhenUsed="0"/>
+    <w:lsdException w:name="Light Grid" w:semiHidden="0" w:uiPriority="62" w:unhideWhenUsed="0"/>
+    <w:lsdException w:name="Medium Shading 1" w:semiHidden="0" w:uiPriority="63" w:unhideWhenUsed="0"/>
+    <w:lsdException w:name="Medium Shading 2" w:semiHidden="0" w:uiPriority="64" w:unhideWhenUsed="0"/>
+    <w:lsdException w:name="Medium List 1" w:semiHidden="0" w:uiPriority="65" w:unhideWhenUsed="0"/>
+    <w:lsdException w:name="Medium List 2" w:semiHidden="0" w:uiPriority="66" w:unhideWhenUsed="0"/>
+    <w:lsdException w:name="Medium Grid 1" w:semiHidden="0" w:uiPriority="67" w:unhideWhenUsed="0"/>
+    <w:lsdException w:name="Medium Grid 2" w:semiHidden="0" w:uiPriority="68" w:unhideWhenUsed="0"/>
+    <w:lsdException w:name="Medium Grid 3" w:semiHidden="0" w:uiPriority="69" w:unhideWhenUsed="0"/>
+    <w:lsdException w:name="Dark List" w:semiHidden="0" w:uiPriority="70" w:unhideWhenUsed="0"/>
+    <w:lsdException w:name="Colorful Shading" w:semiHidden="0" w:uiPriority="71" w:unhideWhenUsed="0"/>
+    <w:lsdException w:name="Colorful List" w:semiHidden="0" w:uiPriority="72" w:unhideWhenUsed="0"/>
+    <w:lsdException w:name="Colorful Grid" w:semiHidden="0" w:uiPriority="73" w:unhideWhenUsed="0"/>
+    <w:lsdException w:name="Light Shading Accent 1" w:semiHidden="0" w:uiPriority="60" w:unhideWhenUsed="0"/>
+    <w:lsdException w:name="Light List Accent 1" w:semiHidden="0" w:uiPriority="61" w:unhideWhenUsed="0"/>
+    <w:lsdException w:name="Light Grid Accent 1" w:semiHidden="0" w:uiPriority="62" w:unhideWhenUsed="0"/>
+    <w:lsdException w:name="Medium Shading 1 Accent 1" w:semiHidden="0" w:uiPriority="63" w:unhideWhenUsed="0"/>
+    <w:lsdException w:name="Medium Shading 2 Accent 1" w:semiHidden="0" w:uiPriority="64" w:unhideWhenUsed="0"/>
+    <w:lsdException w:name="Medium List 1 Accent 1" w:semiHidden="0" w:uiPriority="65" w:unhideWhenUsed="0"/>
+    <w:lsdException w:name="Revision" w:unhideWhenUsed="0"/>
+    <w:lsdException w:name="List Paragraph" w:semiHidden="0" w:uiPriority="34" w:unhideWhenUsed="0" w:qFormat="1"/>
+    <w:lsdException w:name="Quote" w:semiHidden="0" w:uiPriority="29" w:unhideWhenUsed="0" w:qFormat="1"/>
+    <w:lsdException w:name="Intense Quote" w:semiHidden="0" w:uiPriority="30" w:unhideWhenUsed="0" w:qFormat="1"/>
+    <w:lsdException w:name="Medium List 2 Accent 1" w:semiHidden="0" w:uiPriority="66" w:unhideWhenUsed="0"/>
+    <w:lsdException w:name="Medium Grid 1 Accent 1" w:semiHidden="0" w:uiPriority="67" w:unhideWhenUsed="0"/>
+    <w:lsdException w:name="Medium Grid 2 Accent 1" w:semiHidden="0" w:uiPriority="68" w:unhideWhenUsed="0"/>
+    <w:lsdException w:name="Medium Grid 3 Accent 1" w:semiHidden="0" w:uiPriority="69" w:unhideWhenUsed="0"/>
+    <w:lsdException w:name="Dark List Accent 1" w:semiHidden="0" w:uiPriority="70" w:unhideWhenUsed="0"/>
+    <w:lsdException w:name="Colorful Shading Accent 1" w:semiHidden="0" w:uiPriority="71" w:unhideWhenUsed="0"/>
+    <w:lsdException w:name="Colorful List Accent 1" w:semiHidden="0" w:uiPriority="72" w:unhideWhenUsed="0"/>
+    <w:lsdException w:name="Colorful Grid Accent 1" w:semiHidden="0" w:uiPriority="73" w:unhideWhenUsed="0"/>
+    <w:lsdException w:name="Light Shading Accent 2" w:semiHidden="0" w:uiPriority="60" w:unhideWhenUsed="0"/>
+    <w:lsdException w:name="Light List Accent 2" w:semiHidden="0" w:uiPriority="61" w:unhideWhenUsed="0"/>
+    <w:lsdException w:name="Light Grid Accent 2" w:semiHidden="0" w:uiPriority="62" w:unhideWhenUsed="0"/>
+    <w:lsdException w:name="Medium Shading 1 Accent 2" w:semiHidden="0" w:uiPriority="63" w:unhideWhenUsed="0"/>
+    <w:lsdException w:name="Medium Shading 2 Accent 2" w:semiHidden="0" w:uiPriority="64" w:unhideWhenUsed="0"/>
+    <w:lsdException w:name="Medium List 1 Accent 2" w:semiHidden="0" w:uiPriority="65" w:unhideWhenUsed="0"/>
+    <w:lsdException w:name="Medium List 2 Accent 2" w:semiHidden="0" w:uiPriority="66" w:unhideWhenUsed="0"/>
+    <w:lsdException w:name="Medium Grid 1 Accent 2" w:semiHidden="0" w:uiPriority="67" w:unhideWhenUsed="0"/>
+    <w:lsdException w:name="Medium Grid 2 Accent 2" w:semiHidden="0" w:uiPriority="68" w:unhideWhenUsed="0"/>
+    <w:lsdException w:name="Medium Grid 3 Accent 2" w:semiHidden="0" w:uiPriority="69" w:unhideWhenUsed="0"/>
+    <w:lsdException w:name="Dark List Accent 2" w:semiHidden="0" w:uiPriority="70" w:unhideWhenUsed="0"/>
+    <w:lsdException w:name="Colorful Shading Accent 2" w:semiHidden="0" w:uiPriority="71" w:unhideWhenUsed="0"/>
+    <w:lsdException w:name="Colorful List Accent 2" w:semiHidden="0" w:uiPriority="72" w:unhideWhenUsed="0"/>
+    <w:lsdException w:name="Colorful Grid Accent 2" w:semiHidden="0" w:uiPriority="73" w:unhideWhenUsed="0"/>
+    <w:lsdException w:name="Light Shading Accent 3" w:semiHidden="0" w:uiPriority="60" w:unhideWhenUsed="0"/>
+    <w:lsdException w:name="Light List Accent 3" w:semiHidden="0" w:uiPriority="61" w:unhideWhenUsed="0"/>
+    <w:lsdException w:name="Light Grid Accent 3" w:semiHidden="0" w:uiPriority="62" w:unhideWhenUsed="0"/>
+    <w:lsdException w:name="Medium Shading 1 Accent 3" w:semiHidden="0" w:uiPriority="63" w:unhideWhenUsed="0"/>
+    <w:lsdException w:name="Medium Shading 2 Accent 3" w:semiHidden="0" w:uiPriority="64" w:unhideWhenUsed="0"/>
+    <w:lsdException w:name="Medium List 1 Accent 3" w:semiHidden="0" w:uiPriority="65" w:unhideWhenUsed="0"/>
+    <w:lsdException w:name="Medium List 2 Accent 3" w:semiHidden="0" w:uiPriority="66" w:unhideWhenUsed="0"/>
+    <w:lsdException w:name="Medium Grid 1 Accent 3" w:semiHidden="0" w:uiPriority="67" w:unhideWhenUsed="0"/>
+    <w:lsdException w:name="Medium Grid 2 Accent 3" w:semiHidden="0" w:uiPriority="68" w:unhideWhenUsed="0"/>
+    <w:lsdException w:name="Medium Grid 3 Accent 3" w:semiHidden="0" w:uiPriority="69" w:unhideWhenUsed="0"/>
+    <w:lsdException w:name="Dark List Accent 3" w:semiHidden="0" w:uiPriority="70" w:unhideWhenUsed="0"/>
+    <w:lsdException w:name="Colorful Shading Accent 3" w:semiHidden="0" w:uiPriority="71" w:unhideWhenUsed="0"/>
+    <w:lsdException w:name="Colorful List Accent 3" w:semiHidden="0" w:uiPriority="72" w:unhideWhenUsed="0"/>
+    <w:lsdException w:name="Colorful Grid Accent 3" w:semiHidden="0" w:uiPriority="73" w:unhideWhenUsed="0"/>
+    <w:lsdException w:name="Light Shading Accent 4" w:semiHidden="0" w:uiPriority="60" w:unhideWhenUsed="0"/>
+    <w:lsdException w:name="Light List Accent 4" w:semiHidden="0" w:uiPriority="61" w:unhideWhenUsed="0"/>
+    <w:lsdException w:name="Light Grid Accent 4" w:semiHidden="0" w:uiPriority="62" w:unhideWhenUsed="0"/>
+    <w:lsdException w:name="Medium Shading 1 Accent 4" w:semiHidden="0" w:uiPriority="63" w:unhideWhenUsed="0"/>
+    <w:lsdException w:name="Medium Shading 2 Accent 4" w:semiHidden="0" w:uiPriority="64" w:unhideWhenUsed="0"/>
+    <w:lsdException w:name="Medium List 1 Accent 4" w:semiHidden="0" w:uiPriority="65" w:unhideWhenUsed="0"/>
+    <w:lsdException w:name="Medium List 2 Accent 4" w:semiHidden="0" w:uiPriority="66" w:unhideWhenUsed="0"/>
+    <w:lsdException w:name="Medium Grid 1 Accent 4" w:semiHidden="0" w:uiPriority="67" w:unhideWhenUsed="0"/>
+    <w:lsdException w:name="Medium Grid 2 Accent 4" w:semiHidden="0" w:uiPriority="68" w:unhideWhenUsed="0"/>
+    <w:lsdException w:name="Medium Grid 3 Accent 4" w:semiHidden="0" w:uiPriority="69" w:unhideWhenUsed="0"/>
+    <w:lsdException w:name="Dark List Accent 4" w:semiHidden="0" w:uiPriority="70" w:unhideWhenUsed="0"/>
+    <w:lsdException w:name="Colorful Shading Accent 4" w:semiHidden="0" w:uiPriority="71" w:unhideWhenUsed="0"/>
+    <w:lsdException w:name="Colorful List Accent 4" w:semiHidden="0" w:uiPriority="72" w:unhideWhenUsed="0"/>
+    <w:lsdException w:name="Colorful Grid Accent 4" w:semiHidden="0" w:uiPriority="73" w:unhideWhenUsed="0"/>
+    <w:lsdException w:name="Light Shading Accent 5" w:semiHidden="0" w:uiPriority="60" w:unhideWhenUsed="0"/>
+    <w:lsdException w:name="Light List Accent 5" w:semiHidden="0" w:uiPriority="61" w:unhideWhenUsed="0"/>
+    <w:lsdException w:name="Light Grid Accent 5" w:semiHidden="0" w:uiPriority="62" w:unhideWhenUsed="0"/>
+    <w:lsdException w:name="Medium Shading 1 Accent 5" w:semiHidden="0" w:uiPriority="63" w:unhideWhenUsed="0"/>
+    <w:lsdException w:name="Medium Shading 2 Accent 5" w:semiHidden="0" w:uiPriority="64" w:unhideWhenUsed="0"/>
+    <w:lsdException w:name="Medium List 1 Accent 5" w:semiHidden="0" w:uiPriority="65" w:unhideWhenUsed="0"/>
+    <w:lsdException w:name="Medium List 2 Accent 5" w:semiHidden="0" w:uiPriority="66" w:unhideWhenUsed="0"/>
+    <w:lsdException w:name="Medium Grid 1 Accent 5" w:semiHidden="0" w:uiPriority="67" w:unhideWhenUsed="0"/>
+    <w:lsdException w:name="Medium Grid 2 Accent 5" w:semiHidden="0" w:uiPriority="68" w:unhideWhenUsed="0"/>
+    <w:lsdException w:name="Medium Grid 3 Accent 5" w:semiHidden="0" w:uiPriority="69" w:unhideWhenUsed="0"/>
+    <w:lsdException w:name="Dark List Accent 5" w:semiHidden="0" w:uiPriority="70" w:unhideWhenUsed="0"/>
+    <w:lsdException w:name="Colorful Shading Accent 5" w:semiHidden="0" w:uiPriority="71" w:unhideWhenUsed="0"/>
+    <w:lsdException w:name="Colorful List Accent 5" w:semiHidden="0" w:uiPriority="72" w:unhideWhenUsed="0"/>
+    <w:lsdException w:name="Colorful Grid Accent 5" w:semiHidden="0" w:uiPriority="73" w:unhideWhenUsed="0"/>
+    <w:lsdException w:name="Light Shading Accent 6" w:semiHidden="0" w:uiPriority="60" w:unhideWhenUsed="0"/>
+    <w:lsdException w:name="Light List Accent 6" w:semiHidden="0" w:uiPriority="61" w:unhideWhenUsed="0"/>
+    <w:lsdException w:name="Light Grid Accent 6" w:semiHidden="0" w:uiPriority="62" w:unhideWhenUsed="0"/>
+    <w:lsdException w:name="Medium Shading 1 Accent 6" w:semiHidden="0" w:uiPriority="63" w:unhideWhenUsed="0"/>
+    <w:lsdException w:name="Medium Shading 2 Accent 6" w:semiHidden="0" w:uiPriority="64" w:unhideWhenUsed="0"/>
+    <w:lsdException w:name="Medium List 1 Accent 6" w:semiHidden="0" w:uiPriority="65" w:unhideWhenUsed="0"/>
+    <w:lsdException w:name="Medium List 2 Accent 6" w:semiHidden="0" w:uiPriority="66" w:unhideWhenUsed="0"/>
+    <w:lsdException w:name="Medium Grid 1 Accent 6" w:semiHidden="0" w:uiPriority="67" w:unhideWhenUsed="0"/>
+    <w:lsdException w:name="Medium Grid 2 Accent 6" w:semiHidden="0" w:uiPriority="68" w:unhideWhenUsed="0"/>
+    <w:lsdException w:name="Medium Grid 3 Accent 6" w:semiHidden="0" w:uiPriority="69" w:unhideWhenUsed="0"/>
+    <w:lsdException w:name="Dark List Accent 6" w:semiHidden="0" w:uiPriority="70" w:unhideWhenUsed="0"/>
+    <w:lsdException w:name="Colorful Shading Accent 6" w:semiHidden="0" w:uiPriority="71" w:unhideWhenUsed="0"/>
+    <w:lsdException w:name="Colorful List Accent 6" w:semiHidden="0" w:uiPriority="72" w:unhideWhenUsed="0"/>
+    <w:lsdException w:name="Colorful Grid Accent 6" w:semiHidden="0" w:uiPriority="73" w:unhideWhenUsed="0"/>
+    <w:lsdException w:name="Subtle Emphasis" w:semiHidden="0" w:uiPriority="19" w:unhideWhenUsed="0" w:qFormat="1"/>
+    <w:lsdException w:name="Intense Emphasis" w:semiHidden="0" w:uiPriority="21" w:unhideWhenUsed="0" w:qFormat="1"/>
+    <w:lsdException w:name="Subtle Reference" w:semiHidden="0" w:uiPriority="31" w:unhideWhenUsed="0" w:qFormat="1"/>
+    <w:lsdException w:name="Intense Reference" w:semiHidden="0" w:uiPriority="32" w:unhideWhenUsed="0" w:qFormat="1"/>
+    <w:lsdException w:name="Book Title" w:semiHidden="0" w:uiPriority="33" w:unhideWhenUsed="0" w:qFormat="1"/>
+    <w:lsdException w:name="Bibliography" w:uiPriority="37"/>
+    <w:lsdException w:name="TOC Heading" w:uiPriority="39" w:qFormat="1"/>
+  </w:latentStyles>
+  <w:style w:type="paragraph" w:default="1" w:styleId="Normal">
+    <w:name w:val="Normal"/>
+    <w:qFormat/>
+  </w:style>
+  <w:style w:type="character" w:default="1" w:styleId="DefaultParagraphFont">
+    <w:name w:val="Default Paragraph Font"/>
+    <w:uiPriority w:val="1"/>
+    <w:semiHidden/>
+    <w:unhideWhenUsed/>
+  </w:style>
+  <w:style w:type="table" w:default="1" w:styleId="TableNormal">
+    <w:name w:val="Normal Table"/>
+    <w:uiPriority w:val="99"/>
+    <w:semiHidden/>
+    <w:unhideWhenUsed/>
+    <w:tblPr>
+      <w:tblInd w:w="0" w:type="dxa"/>
+      <w:tblCellMar>
+        <w:top w:w="0" w:type="dxa"/>
+        <w:left w:w="108" w:type="dxa"/>
+        <w:bottom w:w="0" w:type="dxa"/>
+        <w:right w:w="108" w:type="dxa"/>
+      </w:tblCellMar>
+    </w:tblPr>
+  </w:style>
+  <w:style w:type="numbering" w:default="1" w:styleId="NoList">
+    <w:name w:val="No List"/>
+    <w:uiPriority w:val="99"/>
+    <w:semiHidden/>
+    <w:unhideWhenUsed/>
+  </w:style>
+</w:styles>
 </file>
 
 <file path=word/theme/theme1.xml><?xml version="1.0" encoding="utf-8"?>

</xml_diff>

<commit_message>
gen(wave-d-b2): khoi phuc muc 7 (M03) + muc 8-9 (M04) qua spec inserts pos:end (nguyen van para 847/1161/1162 ban goc full); fix chk kep Class 15 (PLI_M12 chk_co/chk_khong) surgical — chi canh bao khi legacy sinh key trung, form khac byte-giữ-nguyên (deep idempotency 17/0); cap nhat pin chain-gap + M09 sig allowlist (decontaminate D3.1=A by-design)
</commit_message>
<xml_diff>
--- a/app/templates/PLI_M03.docx
+++ b/app/templates/PLI_M03.docx
@@ -2882,6 +2882,26 @@
           <w:sz-cs w:val="24"/>
         </w:rPr>
         <w:t xml:space="preserve"/>
+      </w:r>
+    </w:p>
+    <w:p>
+      <w:r>
+        <w:rPr>
+          <w:b/>
+        </w:rPr>
+        <w:t>7. Thành viên công ty:</w:t>
+      </w:r>
+      <w:r>
+        <w:t xml:space="preserve"> (</w:t>
+      </w:r>
+      <w:r>
+        <w:rPr>
+          <w:i/>
+        </w:rPr>
+        <w:t>kê khai theo Mẫu số 6 Phụ lục I ban hành kèm theo Thông tư này</w:t>
+      </w:r>
+      <w:r>
+        <w:t>) Gửi kèm.</w:t>
       </w:r>
     </w:p>
     <w:sectPr>

</xml_diff>

<commit_message>
gen(owner-P1): nguồn canonical PLI_M03/M04 đổi sang bản tách ĐẦY ĐỦ (SOURCE_OVERRIDES + drop_until chốt mục kế + xóa inserts superseded); numbering chain so mục POINTER (Gửi kèm) thay vì max — đuôi mục 8-11/10-13 vào template, 124/144 fields; cap_von pin cập nhật 15/0
</commit_message>
<xml_diff>
--- a/app/templates/PLI_M03.docx
+++ b/app/templates/PLI_M03.docx
@@ -1,15 +1,20 @@
 
 <file path=word/document.xml><?xml version="1.0" encoding="utf-8"?>
-<w:document xmlns:w="http://schemas.openxmlformats.org/wordprocessingml/2006/main">
+<w:document xmlns:ve="http://schemas.openxmlformats.org/markup-compatibility/2006" xmlns:o="urn:schemas-microsoft-com:office:office" xmlns:r="http://schemas.openxmlformats.org/officeDocument/2006/relationships" xmlns:v="urn:schemas-microsoft-com:vml" xmlns:wp="http://schemas.openxmlformats.org/drawingml/2006/wordprocessingDrawing" xmlns:w10="urn:schemas-microsoft-com:office:word" xmlns:w="http://schemas.openxmlformats.org/wordprocessingml/2006/main">
   <w:body>
     <w:p>
-      <w:r>
-        <w:t>PL1 - Mau so 3: Giấy đề nghị đăng ký doanh nghiệp - Công ty trách nhiệm hữu hạn hai thành viên trở lên</w:t>
-      </w:r>
-    </w:p>
-    <w:p>
-      <w:r>
-        <w:t>Mẫu số 3</w:t>
+      <w:pPr>
+        <w:jc w:val="right"/>
+        <w:spacing w:before="120"/>
+      </w:pPr>
+      <w:r>
+        <w:rPr>
+          <w:rFonts w:ascii="Arial" w:hAnsi="Arial" w:cs="Arial"/>
+          <w:sz w:val="24"/>
+          <w:sz-cs w:val="24"/>
+          <w:b/>
+        </w:rPr>
+        <w:t xml:space="preserve">Mẫu số 3</w:t>
       </w:r>
     </w:p>
     <w:p>
@@ -2028,7 +2033,7 @@
           <w:sz w:val="24"/>
           <w:sz-cs w:val="24"/>
         </w:rPr>
-        <w:t>: Có {chk_co} Không {chk_auto_khong}</w:t>
+        <w:t>: Có {chk_auto_co} Không {chk_auto_khong}</w:t>
       </w:r>
     </w:p>
     <w:p>
@@ -2885,23 +2890,2349 @@
       </w:r>
     </w:p>
     <w:p>
-      <w:r>
-        <w:rPr>
+      <w:pPr>
+        <w:spacing w:before="120"/>
+      </w:pPr>
+      <w:r>
+        <w:rPr>
+          <w:rFonts w:ascii="Arial" w:hAnsi="Arial" w:cs="Arial"/>
+          <w:sz w:val="24"/>
+          <w:sz-cs w:val="24"/>
           <w:b/>
         </w:rPr>
-        <w:t>7. Thành viên công ty:</w:t>
-      </w:r>
-      <w:r>
+        <w:t xml:space="preserve">7. Thành viên công ty:</w:t>
+      </w:r>
+      <w:r>
+        <w:rPr>
+          <w:rFonts w:ascii="Arial" w:hAnsi="Arial" w:cs="Arial"/>
+          <w:sz w:val="24"/>
+          <w:sz-cs w:val="24"/>
+        </w:rPr>
         <w:t xml:space="preserve"> (</w:t>
       </w:r>
       <w:r>
         <w:rPr>
-          <w:i/>
-        </w:rPr>
-        <w:t>kê khai theo Mẫu số 6 Phụ lục I ban hành kèm theo Thông tư này</w:t>
-      </w:r>
-      <w:r>
-        <w:t>) Gửi kèm.</w:t>
+          <w:rFonts w:ascii="Arial" w:hAnsi="Arial" w:cs="Arial"/>
+          <w:sz w:val="24"/>
+          <w:sz-cs w:val="24"/>
+          <w:i/>
+        </w:rPr>
+        <w:t xml:space="preserve">kê khai theo Mẫu số 6 Phụ lục I ban hành kèm theo Thông tư này</w:t>
+      </w:r>
+      <w:r>
+        <w:rPr>
+          <w:rFonts w:ascii="Arial" w:hAnsi="Arial" w:cs="Arial"/>
+          <w:sz w:val="24"/>
+          <w:sz-cs w:val="24"/>
+        </w:rPr>
+        <w:t xml:space="preserve">) Gửi kèm.</w:t>
+      </w:r>
+      <w:r>
+        <w:rPr>
+          <w:rFonts w:ascii="Arial" w:hAnsi="Arial" w:cs="Arial"/>
+          <w:sz w:val="24"/>
+          <w:sz-cs w:val="24"/>
+          <w:i/>
+        </w:rPr>
+        <w:t xml:space="preserve"> </w:t>
+      </w:r>
+    </w:p>
+    <w:p>
+      <w:pPr>
+        <w:spacing w:before="120"/>
+      </w:pPr>
+      <w:r>
+        <w:rPr>
+          <w:rFonts w:ascii="Arial" w:hAnsi="Arial" w:cs="Arial"/>
+          <w:sz w:val="24"/>
+          <w:sz-cs w:val="24"/>
+        </w:rPr>
+        <w:t xml:space="preserve">- Thông tin về Giấy chứng nhận đăng ký đầu tư (</w:t>
+      </w:r>
+      <w:r>
+        <w:rPr>
+          <w:rFonts w:ascii="Arial" w:hAnsi="Arial" w:cs="Arial"/>
+          <w:sz w:val="24"/>
+          <w:sz-cs w:val="24"/>
+          <w:i/>
+        </w:rPr>
+        <w:t xml:space="preserve">chỉ kê khai trong trường hợp thành viên là nhà đầu tư được cấp Giấy chứng nhận đăng ký đầu tư theo quy định của Luật Đầu tư</w:t>
+      </w:r>
+      <w:r>
+        <w:rPr>
+          <w:rFonts w:ascii="Arial" w:hAnsi="Arial" w:cs="Arial"/>
+          <w:sz w:val="24"/>
+          <w:sz-cs w:val="24"/>
+        </w:rPr>
+        <w:t xml:space="preserve">):</w:t>
+      </w:r>
+    </w:p>
+    <w:p>
+      <w:pPr>
+        <w:spacing w:before="120"/>
+      </w:pPr>
+      <w:r>
+        <w:rPr>
+          <w:rFonts w:ascii="Arial" w:hAnsi="Arial" w:cs="Arial"/>
+          <w:sz w:val="24"/>
+          <w:sz-cs w:val="24"/>
+        </w:rPr>
+        <w:t>Mã số dự án: {ma_so_du_an}</w:t>
+      </w:r>
+    </w:p>
+    <w:p>
+      <w:pPr>
+        <w:spacing w:before="120"/>
+      </w:pPr>
+      <w:r>
+        <w:rPr>
+          <w:rFonts w:ascii="Arial" w:hAnsi="Arial" w:cs="Arial"/>
+          <w:sz w:val="24"/>
+          <w:sz-cs w:val="24"/>
+        </w:rPr>
+        <w:t>Ngày cấp: {ngay_cap} Cơ quan cấp: {co_quan_cap}</w:t>
+        <w:tab/>
+      </w:r>
+    </w:p>
+    <w:p>
+      <w:pPr>
+        <w:spacing w:before="120"/>
+      </w:pPr>
+      <w:r>
+        <w:rPr>
+          <w:rFonts w:ascii="Arial" w:hAnsi="Arial" w:cs="Arial"/>
+          <w:sz w:val="24"/>
+          <w:sz-cs w:val="24"/>
+          <w:b/>
+        </w:rPr>
+        <w:t xml:space="preserve">8. Người đại diện theo pháp luật</w:t>
+      </w:r>
+      <w:r>
+        <w:rPr>
+          <w:rFonts w:ascii="Arial" w:hAnsi="Arial" w:cs="Arial"/>
+          <w:sz w:val="24"/>
+          <w:sz-cs w:val="24"/>
+          <w:b/>
+          <w:vertAlign w:val="superscript"/>
+        </w:rPr>
+        <w:t xml:space="preserve">5:</w:t>
+      </w:r>
+      <w:r>
+        <w:rPr>
+          <w:rFonts w:ascii="Arial" w:hAnsi="Arial" w:cs="Arial"/>
+          <w:sz w:val="24"/>
+          <w:sz-cs w:val="24"/>
+        </w:rPr>
+        <w:t xml:space="preserve"/>
+      </w:r>
+    </w:p>
+    <w:p>
+      <w:pPr>
+        <w:spacing w:before="120"/>
+      </w:pPr>
+      <w:r>
+        <w:rPr>
+          <w:rFonts w:ascii="Arial" w:hAnsi="Arial" w:cs="Arial"/>
+          <w:sz w:val="24"/>
+          <w:sz-cs w:val="24"/>
+        </w:rPr>
+        <w:t>Họ, chữ đệm và tên (</w:t>
+      </w:r>
+      <w:r>
+        <w:rPr>
+          <w:rFonts w:ascii="Arial" w:hAnsi="Arial" w:cs="Arial"/>
+          <w:sz w:val="24"/>
+          <w:sz-cs w:val="24"/>
+          <w:i/>
+        </w:rPr>
+        <w:t>ghi bằng chữ in hoa</w:t>
+      </w:r>
+      <w:r>
+        <w:rPr>
+          <w:rFonts w:ascii="Arial" w:hAnsi="Arial" w:cs="Arial"/>
+          <w:sz w:val="24"/>
+          <w:sz-cs w:val="24"/>
+        </w:rPr>
+        <w:t>): {ndd.ho_ten}</w:t>
+      </w:r>
+    </w:p>
+    <w:p>
+      <w:pPr>
+        <w:spacing w:before="120"/>
+      </w:pPr>
+      <w:r>
+        <w:rPr>
+          <w:rFonts w:ascii="Arial" w:hAnsi="Arial" w:cs="Arial"/>
+          <w:sz w:val="24"/>
+          <w:sz-cs w:val="24"/>
+        </w:rPr>
+        <w:t>Ngày, tháng, năm sinh: {ndd.ngay_sinh}/{ndd.thang_sinh}/{ndd.nam_sinh}</w:t>
+      </w:r>
+    </w:p>
+    <w:p>
+      <w:pPr>
+        <w:spacing w:before="120"/>
+      </w:pPr>
+      <w:r>
+        <w:rPr>
+          <w:rFonts w:ascii="Arial" w:hAnsi="Arial" w:cs="Arial"/>
+          <w:sz w:val="24"/>
+          <w:sz-cs w:val="24"/>
+        </w:rPr>
+        <w:t>Giới tính: {ndd.gioi_tinh}</w:t>
+      </w:r>
+    </w:p>
+    <w:p>
+      <w:pPr>
+        <w:spacing w:before="120"/>
+      </w:pPr>
+      <w:r>
+        <w:rPr>
+          <w:rFonts w:ascii="Arial" w:hAnsi="Arial" w:cs="Arial"/>
+          <w:sz w:val="24"/>
+          <w:sz-cs w:val="24"/>
+        </w:rPr>
+        <w:t>Số định danh cá nhân: {ndd.so_cccd}</w:t>
+      </w:r>
+    </w:p>
+    <w:p>
+      <w:pPr>
+        <w:spacing w:before="120"/>
+      </w:pPr>
+      <w:r>
+        <w:rPr>
+          <w:rFonts w:ascii="Arial" w:hAnsi="Arial" w:cs="Arial"/>
+          <w:sz w:val="24"/>
+          <w:sz-cs w:val="24"/>
+        </w:rPr>
+        <w:t>Chức danh: {ndd.chuc_vu}</w:t>
+      </w:r>
+    </w:p>
+    <w:p>
+      <w:pPr>
+        <w:spacing w:before="120"/>
+      </w:pPr>
+      <w:r>
+        <w:rPr>
+          <w:rFonts w:ascii="Arial" w:hAnsi="Arial" w:cs="Arial"/>
+          <w:sz w:val="24"/>
+          <w:sz-cs w:val="24"/>
+        </w:rPr>
+        <w:t xml:space="preserve">Địa chỉ liên lạc: </w:t>
+      </w:r>
+    </w:p>
+    <w:p>
+      <w:pPr>
+        <w:spacing w:before="120"/>
+      </w:pPr>
+      <w:r>
+        <w:rPr>
+          <w:rFonts w:ascii="Arial" w:hAnsi="Arial" w:cs="Arial"/>
+          <w:sz w:val="24"/>
+          <w:sz-cs w:val="24"/>
+        </w:rPr>
+        <w:t>Số nhà/phòng, ngách/hẻm, ngõ/kiệt, đường/phố/đại lộ, tổ/xóm/ấp/thôn: {dia_chi_chi_tiet}</w:t>
+      </w:r>
+    </w:p>
+    <w:p>
+      <w:pPr>
+        <w:spacing w:before="120"/>
+      </w:pPr>
+      <w:r>
+        <w:rPr>
+          <w:rFonts w:ascii="Arial" w:hAnsi="Arial" w:cs="Arial"/>
+          <w:sz w:val="24"/>
+          <w:sz-cs w:val="24"/>
+        </w:rPr>
+        <w:t>Xã/Phường/Đặc khu: {xa_phuong}</w:t>
+      </w:r>
+    </w:p>
+    <w:p>
+      <w:pPr>
+        <w:spacing w:before="120"/>
+      </w:pPr>
+      <w:r>
+        <w:rPr>
+          <w:rFonts w:ascii="Arial" w:hAnsi="Arial" w:cs="Arial"/>
+          <w:sz w:val="24"/>
+          <w:sz-cs w:val="24"/>
+        </w:rPr>
+        <w:t>Tỉnh/Thành phố trực thuộc trung ương: {tinh_thanh}</w:t>
+      </w:r>
+    </w:p>
+    <w:p>
+      <w:pPr>
+        <w:spacing w:before="120"/>
+      </w:pPr>
+      <w:r>
+        <w:rPr>
+          <w:rFonts w:ascii="Arial" w:hAnsi="Arial" w:cs="Arial"/>
+          <w:sz w:val="24"/>
+          <w:sz-cs w:val="24"/>
+        </w:rPr>
+        <w:t>Quốc gia: {quoc_gia}</w:t>
+      </w:r>
+    </w:p>
+    <w:p>
+      <w:pPr>
+        <w:spacing w:before="120"/>
+      </w:pPr>
+      <w:r>
+        <w:rPr>
+          <w:rFonts w:ascii="Arial" w:hAnsi="Arial" w:cs="Arial"/>
+          <w:sz w:val="24"/>
+          <w:sz-cs w:val="24"/>
+        </w:rPr>
+        <w:t>Điện thoại</w:t>
+      </w:r>
+      <w:r>
+        <w:rPr>
+          <w:rFonts w:ascii="Arial" w:hAnsi="Arial" w:cs="Arial"/>
+          <w:sz w:val="24"/>
+          <w:sz-cs w:val="24"/>
+          <w:i/>
+        </w:rPr>
+        <w:t xml:space="preserve"> (nếu có)</w:t>
+      </w:r>
+      <w:r>
+        <w:rPr>
+          <w:rFonts w:ascii="Arial" w:hAnsi="Arial" w:cs="Arial"/>
+          <w:sz w:val="24"/>
+          <w:sz-cs w:val="24"/>
+        </w:rPr>
+        <w:t>: {dien_thoai_lien_he} Thư điện tử</w:t>
+      </w:r>
+      <w:r>
+        <w:rPr>
+          <w:rFonts w:ascii="Arial" w:hAnsi="Arial" w:cs="Arial"/>
+          <w:sz w:val="24"/>
+          <w:sz-cs w:val="24"/>
+          <w:i/>
+        </w:rPr>
+        <w:t xml:space="preserve"> (nếu có)</w:t>
+      </w:r>
+      <w:r>
+        <w:rPr>
+          <w:rFonts w:ascii="Arial" w:hAnsi="Arial" w:cs="Arial"/>
+          <w:sz w:val="24"/>
+          <w:sz-cs w:val="24"/>
+        </w:rPr>
+        <w:t>: {email_tru_so}</w:t>
+      </w:r>
+    </w:p>
+    <w:p>
+      <w:pPr>
+        <w:spacing w:before="120"/>
+      </w:pPr>
+      <w:r>
+        <w:rPr>
+          <w:rFonts w:ascii="Arial" w:hAnsi="Arial" w:cs="Arial"/>
+          <w:sz w:val="24"/>
+          <w:sz-cs w:val="24"/>
+          <w:i/>
+        </w:rPr>
+        <w:t xml:space="preserve">Trường hợp không có số định danh cá nhân hoặc việc kết nối giữa Cơ sở dữ liệu quốc gia về đăng ký doanh nghiệp với Cơ sở dữ liệu quốc gia về dân cư bị gián đoạn thì đề nghị kê khai các thông tin cá nhân dưới đây:</w:t>
+      </w:r>
+    </w:p>
+    <w:p>
+      <w:pPr>
+        <w:spacing w:before="120"/>
+      </w:pPr>
+      <w:r>
+        <w:rPr>
+          <w:rFonts w:ascii="Arial" w:hAnsi="Arial" w:cs="Arial"/>
+          <w:sz w:val="24"/>
+          <w:sz-cs w:val="24"/>
+        </w:rPr>
+        <w:t>Dân tộc: {chu_hkd.dan_toc} Quốc tịch: {chu_hkd.quoc_tich}</w:t>
+      </w:r>
+    </w:p>
+    <w:p>
+      <w:pPr>
+        <w:spacing w:before="120"/>
+      </w:pPr>
+      <w:r>
+        <w:rPr>
+          <w:rFonts w:ascii="Arial" w:hAnsi="Arial" w:cs="Arial"/>
+          <w:sz w:val="24"/>
+          <w:sz-cs w:val="24"/>
+        </w:rPr>
+        <w:t>Số Hộ chiếu (</w:t>
+      </w:r>
+      <w:r>
+        <w:rPr>
+          <w:rFonts w:ascii="Arial" w:hAnsi="Arial" w:cs="Arial"/>
+          <w:sz w:val="24"/>
+          <w:sz-cs w:val="24"/>
+          <w:i/>
+        </w:rPr>
+        <w:t>đối với cá nhân Việt Nam không có số định danh cá nhân</w:t>
+      </w:r>
+      <w:r>
+        <w:rPr>
+          <w:rFonts w:ascii="Arial" w:hAnsi="Arial" w:cs="Arial"/>
+          <w:sz w:val="24"/>
+          <w:sz-cs w:val="24"/>
+        </w:rPr>
+        <w:t>)/Số Hộ chiếu nước ngoài hoặc giấy tờ có giá trị thay thế hộ chiếu nước ngoài (</w:t>
+      </w:r>
+      <w:r>
+        <w:rPr>
+          <w:rFonts w:ascii="Arial" w:hAnsi="Arial" w:cs="Arial"/>
+          <w:sz w:val="24"/>
+          <w:sz-cs w:val="24"/>
+          <w:i/>
+        </w:rPr>
+        <w:t>đối với cá nhân là người nước ngoài</w:t>
+      </w:r>
+      <w:r>
+        <w:rPr>
+          <w:rFonts w:ascii="Arial" w:hAnsi="Arial" w:cs="Arial"/>
+          <w:sz w:val="24"/>
+          <w:sz-cs w:val="24"/>
+        </w:rPr>
+        <w:t>): {chu_hkd.so_cccd}</w:t>
+      </w:r>
+    </w:p>
+    <w:p>
+      <w:pPr>
+        <w:spacing w:before="120"/>
+      </w:pPr>
+      <w:r>
+        <w:rPr>
+          <w:rFonts w:ascii="Arial" w:hAnsi="Arial" w:cs="Arial"/>
+          <w:sz w:val="24"/>
+          <w:sz-cs w:val="24"/>
+        </w:rPr>
+        <w:t xml:space="preserve">Ngày cấp: {ngay_cap} Nơi cấp: {noi_cap} </w:t>
+        <w:tab/>
+      </w:r>
+    </w:p>
+    <w:p>
+      <w:pPr>
+        <w:spacing w:before="120"/>
+      </w:pPr>
+      <w:r>
+        <w:rPr>
+          <w:rFonts w:ascii="Arial" w:hAnsi="Arial" w:cs="Arial"/>
+          <w:sz w:val="24"/>
+          <w:sz-cs w:val="24"/>
+        </w:rPr>
+        <w:t xml:space="preserve">Nơi thường trú:</w:t>
+      </w:r>
+    </w:p>
+    <w:p>
+      <w:pPr>
+        <w:spacing w:before="120"/>
+      </w:pPr>
+      <w:r>
+        <w:rPr>
+          <w:rFonts w:ascii="Arial" w:hAnsi="Arial" w:cs="Arial"/>
+          <w:sz w:val="24"/>
+          <w:sz-cs w:val="24"/>
+        </w:rPr>
+        <w:t>Số nhà/phòng, ngách/hẻm, ngõ/kiệt, đường/phố/đại lộ, tổ/xóm/ấp/thôn: {dia_chi_chi_tiet}</w:t>
+      </w:r>
+    </w:p>
+    <w:p>
+      <w:pPr>
+        <w:spacing w:before="120"/>
+      </w:pPr>
+      <w:r>
+        <w:rPr>
+          <w:rFonts w:ascii="Arial" w:hAnsi="Arial" w:cs="Arial"/>
+          <w:sz w:val="24"/>
+          <w:sz-cs w:val="24"/>
+        </w:rPr>
+        <w:t>Xã/Phường/Đặc khu: {xa_phuong}</w:t>
+      </w:r>
+    </w:p>
+    <w:p>
+      <w:pPr>
+        <w:spacing w:before="120"/>
+      </w:pPr>
+      <w:r>
+        <w:rPr>
+          <w:rFonts w:ascii="Arial" w:hAnsi="Arial" w:cs="Arial"/>
+          <w:sz w:val="24"/>
+          <w:sz-cs w:val="24"/>
+        </w:rPr>
+        <w:t>Tỉnh/Thành phố trực thuộc trung ương: {tinh_thanh}</w:t>
+      </w:r>
+    </w:p>
+    <w:p>
+      <w:pPr>
+        <w:spacing w:before="120"/>
+      </w:pPr>
+      <w:r>
+        <w:rPr>
+          <w:rFonts w:ascii="Arial" w:hAnsi="Arial" w:cs="Arial"/>
+          <w:sz w:val="24"/>
+          <w:sz-cs w:val="24"/>
+        </w:rPr>
+        <w:t>Quốc gia: {quoc_gia}</w:t>
+      </w:r>
+    </w:p>
+    <w:p>
+      <w:pPr>
+        <w:spacing w:before="120"/>
+      </w:pPr>
+      <w:r>
+        <w:rPr>
+          <w:rFonts w:ascii="Arial" w:hAnsi="Arial" w:cs="Arial"/>
+          <w:sz w:val="24"/>
+          <w:sz-cs w:val="24"/>
+          <w:b/>
+        </w:rPr>
+        <w:t xml:space="preserve">9. Thông tin đăng ký thuế</w:t>
+      </w:r>
+      <w:r>
+        <w:rPr>
+          <w:rFonts w:ascii="Arial" w:hAnsi="Arial" w:cs="Arial"/>
+          <w:sz w:val="24"/>
+          <w:sz-cs w:val="24"/>
+        </w:rPr>
+        <w:t xml:space="preserve">:</w:t>
+      </w:r>
+    </w:p>
+    <w:p>
+      <w:pPr>
+        <w:jc w:val="center"/>
+        <w:spacing w:before="120"/>
+      </w:pPr>
+      <w:r>
+        <w:rPr>
+          <w:rFonts w:ascii="Arial" w:hAnsi="Arial" w:cs="Arial"/>
+          <w:sz w:val="24"/>
+          <w:sz-cs w:val="24"/>
+        </w:rPr>
+        <w:t xml:space="preserve">STT</w:t>
+      </w:r>
+    </w:p>
+    <w:p>
+      <w:pPr>
+        <w:spacing w:before="120"/>
+      </w:pPr>
+      <w:r>
+        <w:rPr>
+          <w:rFonts w:ascii="Arial" w:hAnsi="Arial" w:cs="Arial"/>
+          <w:sz w:val="24"/>
+          <w:sz-cs w:val="24"/>
+        </w:rPr>
+        <w:t xml:space="preserve">Các chỉ tiêu thông tin đăng ký thuế</w:t>
+      </w:r>
+    </w:p>
+    <w:p>
+      <w:pPr>
+        <w:jc w:val="center"/>
+        <w:spacing w:before="120"/>
+      </w:pPr>
+      <w:r>
+        <w:rPr>
+          <w:rFonts w:ascii="Arial" w:hAnsi="Arial" w:cs="Arial"/>
+          <w:sz w:val="24"/>
+          <w:sz-cs w:val="24"/>
+        </w:rPr>
+        <w:t xml:space="preserve">9.1</w:t>
+      </w:r>
+    </w:p>
+    <w:p>
+      <w:pPr>
+        <w:spacing w:before="120"/>
+      </w:pPr>
+      <w:r>
+        <w:rPr>
+          <w:rFonts w:ascii="Arial" w:hAnsi="Arial" w:cs="Arial"/>
+          <w:sz w:val="24"/>
+          <w:sz-cs w:val="24"/>
+        </w:rPr>
+        <w:t xml:space="preserve">Thông tin về Giám đốc/Tổng giám đốc </w:t>
+      </w:r>
+      <w:r>
+        <w:rPr>
+          <w:rFonts w:ascii="Arial" w:hAnsi="Arial" w:cs="Arial"/>
+          <w:sz w:val="24"/>
+          <w:sz-cs w:val="24"/>
+          <w:i/>
+        </w:rPr>
+        <w:t xml:space="preserve">(nếu có)</w:t>
+      </w:r>
+      <w:r>
+        <w:rPr>
+          <w:rFonts w:ascii="Arial" w:hAnsi="Arial" w:cs="Arial"/>
+          <w:sz w:val="24"/>
+          <w:sz-cs w:val="24"/>
+        </w:rPr>
+        <w:t xml:space="preserve">:</w:t>
+      </w:r>
+    </w:p>
+    <w:p>
+      <w:pPr>
+        <w:spacing w:before="120"/>
+      </w:pPr>
+      <w:r>
+        <w:rPr>
+          <w:rFonts w:ascii="Arial" w:hAnsi="Arial" w:cs="Arial"/>
+          <w:sz w:val="24"/>
+          <w:sz-cs w:val="24"/>
+        </w:rPr>
+        <w:t>Họ, chữ đệm và tên Giám đốc/Tổng giám đốc:{gd.ho_ten}</w:t>
+      </w:r>
+    </w:p>
+    <w:p>
+      <w:pPr>
+        <w:spacing w:before="120"/>
+      </w:pPr>
+      <w:r>
+        <w:rPr>
+          <w:rFonts w:ascii="Arial" w:hAnsi="Arial" w:cs="Arial"/>
+          <w:sz w:val="24"/>
+          <w:sz-cs w:val="24"/>
+        </w:rPr>
+        <w:t>Ngày, tháng, năm sinh: {gd.ngay_sinh}/{gd.thang_sinh}/{gd.nam_sinh}</w:t>
+      </w:r>
+    </w:p>
+    <w:p>
+      <w:pPr>
+        <w:spacing w:before="120"/>
+      </w:pPr>
+      <w:r>
+        <w:rPr>
+          <w:rFonts w:ascii="Arial" w:hAnsi="Arial" w:cs="Arial"/>
+          <w:sz w:val="24"/>
+          <w:sz-cs w:val="24"/>
+        </w:rPr>
+        <w:t>Giới tính: {gd.gioi_tinh}</w:t>
+      </w:r>
+    </w:p>
+    <w:p>
+      <w:pPr>
+        <w:spacing w:before="120"/>
+      </w:pPr>
+      <w:r>
+        <w:rPr>
+          <w:rFonts w:ascii="Arial" w:hAnsi="Arial" w:cs="Arial"/>
+          <w:sz w:val="24"/>
+          <w:sz-cs w:val="24"/>
+        </w:rPr>
+        <w:t>Số định danh cá nhân: {gd.so_cccd}</w:t>
+      </w:r>
+    </w:p>
+    <w:p>
+      <w:pPr>
+        <w:spacing w:before="120"/>
+      </w:pPr>
+      <w:r>
+        <w:rPr>
+          <w:rFonts w:ascii="Arial" w:hAnsi="Arial" w:cs="Arial"/>
+          <w:sz w:val="24"/>
+          <w:sz-cs w:val="24"/>
+        </w:rPr>
+        <w:t>Điện thoại:{gd.dien_thoai}</w:t>
+      </w:r>
+    </w:p>
+    <w:p>
+      <w:pPr>
+        <w:jc w:val="center"/>
+        <w:spacing w:before="120"/>
+      </w:pPr>
+      <w:r>
+        <w:rPr>
+          <w:rFonts w:ascii="Arial" w:hAnsi="Arial" w:cs="Arial"/>
+          <w:sz w:val="24"/>
+          <w:sz-cs w:val="24"/>
+        </w:rPr>
+        <w:t xml:space="preserve">9.2</w:t>
+      </w:r>
+    </w:p>
+    <w:p>
+      <w:pPr>
+        <w:spacing w:before="120"/>
+      </w:pPr>
+      <w:r>
+        <w:rPr>
+          <w:rFonts w:ascii="Arial" w:hAnsi="Arial" w:cs="Arial"/>
+          <w:sz w:val="24"/>
+          <w:sz-cs w:val="24"/>
+        </w:rPr>
+        <w:t xml:space="preserve">Thông tin về Kế toán trưởng/Phụ trách kế toán </w:t>
+      </w:r>
+      <w:r>
+        <w:rPr>
+          <w:rFonts w:ascii="Arial" w:hAnsi="Arial" w:cs="Arial"/>
+          <w:sz w:val="24"/>
+          <w:sz-cs w:val="24"/>
+          <w:i/>
+        </w:rPr>
+        <w:t xml:space="preserve">(nếu có)</w:t>
+      </w:r>
+      <w:r>
+        <w:rPr>
+          <w:rFonts w:ascii="Arial" w:hAnsi="Arial" w:cs="Arial"/>
+          <w:sz w:val="24"/>
+          <w:sz-cs w:val="24"/>
+        </w:rPr>
+        <w:t xml:space="preserve">:</w:t>
+      </w:r>
+    </w:p>
+    <w:p>
+      <w:pPr>
+        <w:spacing w:before="120"/>
+      </w:pPr>
+      <w:r>
+        <w:rPr>
+          <w:rFonts w:ascii="Arial" w:hAnsi="Arial" w:cs="Arial"/>
+          <w:sz w:val="24"/>
+          <w:sz-cs w:val="24"/>
+        </w:rPr>
+        <w:t>Họ, chữ đệm và tên Kế toán trưởng/Phụ trách kế toán:{kt.ho_ten}</w:t>
+      </w:r>
+    </w:p>
+    <w:p>
+      <w:pPr>
+        <w:spacing w:before="120"/>
+      </w:pPr>
+      <w:r>
+        <w:rPr>
+          <w:rFonts w:ascii="Arial" w:hAnsi="Arial" w:cs="Arial"/>
+          <w:sz w:val="24"/>
+          <w:sz-cs w:val="24"/>
+        </w:rPr>
+        <w:t>Ngày, tháng, năm sinh: {kt.ngay_sinh}/{kt.thang_sinh}/{kt.nam_sinh}</w:t>
+      </w:r>
+    </w:p>
+    <w:p>
+      <w:pPr>
+        <w:spacing w:before="120"/>
+      </w:pPr>
+      <w:r>
+        <w:rPr>
+          <w:rFonts w:ascii="Arial" w:hAnsi="Arial" w:cs="Arial"/>
+          <w:sz w:val="24"/>
+          <w:sz-cs w:val="24"/>
+        </w:rPr>
+        <w:t>Giới tính: {kt.gioi_tinh}</w:t>
+      </w:r>
+    </w:p>
+    <w:p>
+      <w:pPr>
+        <w:spacing w:before="120"/>
+      </w:pPr>
+      <w:r>
+        <w:rPr>
+          <w:rFonts w:ascii="Arial" w:hAnsi="Arial" w:cs="Arial"/>
+          <w:sz w:val="24"/>
+          <w:sz-cs w:val="24"/>
+        </w:rPr>
+        <w:t>Số định danh cá nhân: {kt.so_cccd}</w:t>
+      </w:r>
+    </w:p>
+    <w:p>
+      <w:pPr>
+        <w:spacing w:before="120"/>
+      </w:pPr>
+      <w:r>
+        <w:rPr>
+          <w:rFonts w:ascii="Arial" w:hAnsi="Arial" w:cs="Arial"/>
+          <w:sz w:val="24"/>
+          <w:sz-cs w:val="24"/>
+        </w:rPr>
+        <w:t>Điện thoại:{kt.dien_thoai}</w:t>
+      </w:r>
+    </w:p>
+    <w:p>
+      <w:pPr>
+        <w:jc w:val="center"/>
+        <w:spacing w:before="120"/>
+      </w:pPr>
+      <w:r>
+        <w:rPr>
+          <w:rFonts w:ascii="Arial" w:hAnsi="Arial" w:cs="Arial"/>
+          <w:sz w:val="24"/>
+          <w:sz-cs w:val="24"/>
+        </w:rPr>
+        <w:t xml:space="preserve">9.3</w:t>
+      </w:r>
+    </w:p>
+    <w:p>
+      <w:pPr>
+        <w:spacing w:before="120"/>
+      </w:pPr>
+      <w:r>
+        <w:rPr>
+          <w:rFonts w:ascii="Arial" w:hAnsi="Arial" w:cs="Arial"/>
+          <w:sz w:val="24"/>
+          <w:sz-cs w:val="24"/>
+        </w:rPr>
+        <w:t xml:space="preserve">Địa chỉ nhận thông báo thuế (</w:t>
+      </w:r>
+      <w:r>
+        <w:rPr>
+          <w:rFonts w:ascii="Arial" w:hAnsi="Arial" w:cs="Arial"/>
+          <w:sz w:val="24"/>
+          <w:sz-cs w:val="24"/>
+          <w:i/>
+        </w:rPr>
+        <w:t xml:space="preserve">chỉ kê khai nếu địa chỉ nhận thông báo thuế khác địa chỉ trụ sở chính</w:t>
+      </w:r>
+      <w:r>
+        <w:rPr>
+          <w:rFonts w:ascii="Arial" w:hAnsi="Arial" w:cs="Arial"/>
+          <w:sz w:val="24"/>
+          <w:sz-cs w:val="24"/>
+        </w:rPr>
+        <w:t xml:space="preserve">):</w:t>
+      </w:r>
+    </w:p>
+    <w:p>
+      <w:pPr>
+        <w:spacing w:before="120"/>
+      </w:pPr>
+      <w:r>
+        <w:rPr>
+          <w:rFonts w:ascii="Arial" w:hAnsi="Arial" w:cs="Arial"/>
+          <w:sz w:val="24"/>
+          <w:sz-cs w:val="24"/>
+        </w:rPr>
+        <w:t>Số nhà/phòng, ngách/hẻm, ngõ/kiệt, đường/phố/đại lộ, tổ/xóm/ấp/thôn: {dia_chi_chi_tiet}</w:t>
+      </w:r>
+    </w:p>
+    <w:p>
+      <w:pPr>
+        <w:spacing w:before="120"/>
+      </w:pPr>
+      <w:r>
+        <w:rPr>
+          <w:rFonts w:ascii="Arial" w:hAnsi="Arial" w:cs="Arial"/>
+          <w:sz w:val="24"/>
+          <w:sz-cs w:val="24"/>
+        </w:rPr>
+        <w:t>Xã/Phường/Đặc khu: {xa_phuong}</w:t>
+      </w:r>
+    </w:p>
+    <w:p>
+      <w:pPr>
+        <w:spacing w:before="120"/>
+      </w:pPr>
+      <w:r>
+        <w:rPr>
+          <w:rFonts w:ascii="Arial" w:hAnsi="Arial" w:cs="Arial"/>
+          <w:sz w:val="24"/>
+          <w:sz-cs w:val="24"/>
+        </w:rPr>
+        <w:t>Tỉnh/Thành phố trực thuộc trung ương: {tinh_thanh}</w:t>
+      </w:r>
+    </w:p>
+    <w:p>
+      <w:pPr>
+        <w:spacing w:before="120"/>
+      </w:pPr>
+      <w:r>
+        <w:rPr>
+          <w:rFonts w:ascii="Arial" w:hAnsi="Arial" w:cs="Arial"/>
+          <w:sz w:val="24"/>
+          <w:sz-cs w:val="24"/>
+        </w:rPr>
+        <w:t>Điện thoại (</w:t>
+      </w:r>
+      <w:r>
+        <w:rPr>
+          <w:rFonts w:ascii="Arial" w:hAnsi="Arial" w:cs="Arial"/>
+          <w:sz w:val="24"/>
+          <w:sz-cs w:val="24"/>
+          <w:i/>
+        </w:rPr>
+        <w:t>nếu có</w:t>
+      </w:r>
+      <w:r>
+        <w:rPr>
+          <w:rFonts w:ascii="Arial" w:hAnsi="Arial" w:cs="Arial"/>
+          <w:sz w:val="24"/>
+          <w:sz-cs w:val="24"/>
+        </w:rPr>
+        <w:t>): {dien_thoai_lien_he}Số fax (</w:t>
+      </w:r>
+      <w:r>
+        <w:rPr>
+          <w:rFonts w:ascii="Arial" w:hAnsi="Arial" w:cs="Arial"/>
+          <w:sz w:val="24"/>
+          <w:sz-cs w:val="24"/>
+          <w:i/>
+        </w:rPr>
+        <w:t>nếu có</w:t>
+      </w:r>
+      <w:r>
+        <w:rPr>
+          <w:rFonts w:ascii="Arial" w:hAnsi="Arial" w:cs="Arial"/>
+          <w:sz w:val="24"/>
+          <w:sz-cs w:val="24"/>
+        </w:rPr>
+        <w:t>):{fax}</w:t>
+      </w:r>
+    </w:p>
+    <w:p>
+      <w:pPr>
+        <w:spacing w:before="120"/>
+      </w:pPr>
+      <w:r>
+        <w:rPr>
+          <w:rFonts w:ascii="Arial" w:hAnsi="Arial" w:cs="Arial"/>
+          <w:sz w:val="24"/>
+          <w:sz-cs w:val="24"/>
+        </w:rPr>
+        <w:t>Thư điện tử (</w:t>
+      </w:r>
+      <w:r>
+        <w:rPr>
+          <w:rFonts w:ascii="Arial" w:hAnsi="Arial" w:cs="Arial"/>
+          <w:sz w:val="24"/>
+          <w:sz-cs w:val="24"/>
+          <w:i/>
+        </w:rPr>
+        <w:t>nếu có</w:t>
+      </w:r>
+      <w:r>
+        <w:rPr>
+          <w:rFonts w:ascii="Arial" w:hAnsi="Arial" w:cs="Arial"/>
+          <w:sz w:val="24"/>
+          <w:sz-cs w:val="24"/>
+        </w:rPr>
+        <w:t>):{email_tru_so}</w:t>
+      </w:r>
+    </w:p>
+    <w:p>
+      <w:pPr>
+        <w:jc w:val="center"/>
+        <w:spacing w:before="120"/>
+      </w:pPr>
+      <w:r>
+        <w:rPr>
+          <w:rFonts w:ascii="Arial" w:hAnsi="Arial" w:cs="Arial"/>
+          <w:sz w:val="24"/>
+          <w:sz-cs w:val="24"/>
+        </w:rPr>
+        <w:t xml:space="preserve">9.4</w:t>
+      </w:r>
+    </w:p>
+    <w:p>
+      <w:pPr>
+        <w:spacing w:before="120"/>
+      </w:pPr>
+      <w:r>
+        <w:rPr>
+          <w:rFonts w:ascii="Arial" w:hAnsi="Arial" w:cs="Arial"/>
+          <w:sz w:val="24"/>
+          <w:sz-cs w:val="24"/>
+        </w:rPr>
+        <w:t>Ngày bắt đầu hoạt động</w:t>
+      </w:r>
+      <w:r>
+        <w:rPr>
+          <w:rFonts w:ascii="Arial" w:hAnsi="Arial" w:cs="Arial"/>
+          <w:sz w:val="24"/>
+          <w:sz-cs w:val="24"/>
+          <w:vertAlign w:val="superscript"/>
+        </w:rPr>
+        <w:t>6</w:t>
+      </w:r>
+      <w:r>
+        <w:rPr>
+          <w:rFonts w:ascii="Arial" w:hAnsi="Arial" w:cs="Arial"/>
+          <w:sz w:val="24"/>
+          <w:sz-cs w:val="24"/>
+        </w:rPr>
+        <w:t xml:space="preserve"> (</w:t>
+      </w:r>
+      <w:r>
+        <w:rPr>
+          <w:rFonts w:ascii="Arial" w:hAnsi="Arial" w:cs="Arial"/>
+          <w:sz w:val="24"/>
+          <w:sz-cs w:val="24"/>
+          <w:i/>
+        </w:rPr>
+        <w:t>trường hợp doanh nghiệp dự kiến bắt đầu hoạt động kể từ ngày được cấp Giấy chứng nhận đăng ký doanh nghiệp thì không cần kê khai nội dung này</w:t>
+      </w:r>
+      <w:r>
+        <w:rPr>
+          <w:rFonts w:ascii="Arial" w:hAnsi="Arial" w:cs="Arial"/>
+          <w:sz w:val="24"/>
+          <w:sz-cs w:val="24"/>
+        </w:rPr>
+        <w:t>): {ngay_bd}/{thang_bd}/{nam_bd}</w:t>
+      </w:r>
+    </w:p>
+    <w:p>
+      <w:pPr>
+        <w:jc w:val="center"/>
+        <w:spacing w:before="120"/>
+      </w:pPr>
+      <w:r>
+        <w:rPr>
+          <w:rFonts w:ascii="Arial" w:hAnsi="Arial" w:cs="Arial"/>
+          <w:sz w:val="24"/>
+          <w:sz-cs w:val="24"/>
+        </w:rPr>
+        <w:t xml:space="preserve">9.5</w:t>
+      </w:r>
+    </w:p>
+    <w:p>
+      <w:pPr>
+        <w:spacing w:before="120"/>
+      </w:pPr>
+      <w:r>
+        <w:rPr>
+          <w:rFonts w:ascii="Arial" w:hAnsi="Arial" w:cs="Arial"/>
+          <w:sz w:val="24"/>
+          <w:sz-cs w:val="24"/>
+        </w:rPr>
+        <w:t xml:space="preserve">Hình thức hạch toán (</w:t>
+      </w:r>
+      <w:r>
+        <w:rPr>
+          <w:rFonts w:ascii="Arial" w:hAnsi="Arial" w:cs="Arial"/>
+          <w:sz w:val="24"/>
+          <w:sz-cs w:val="24"/>
+          <w:i/>
+        </w:rPr>
+        <w:t xml:space="preserve">Đánh dấu X vào một trong hai ô “Hạch toán độc lập” hoặc “Hạch toán phụ thuộc”. Trường hợp chọn ô “Hạch toán độc lập” mà thuộc đối tượng phải lập và gửi báo cáo tài chính hợp nhất cho cơ quan có thẩm quyền theo quy định thì chọn thêm ô “Có báo cáo tài chính hợp nhất”</w:t>
+      </w:r>
+      <w:r>
+        <w:rPr>
+          <w:rFonts w:ascii="Arial" w:hAnsi="Arial" w:cs="Arial"/>
+          <w:sz w:val="24"/>
+          <w:sz-cs w:val="24"/>
+        </w:rPr>
+        <w:t xml:space="preserve">): </w:t>
+      </w:r>
+    </w:p>
+    <w:p>
+      <w:pPr>
+        <w:spacing w:before="120"/>
+      </w:pPr>
+      <w:r>
+        <w:rPr>
+          <w:rFonts w:ascii="Arial" w:hAnsi="Arial" w:cs="Arial"/>
+          <w:sz w:val="24"/>
+          <w:sz-cs w:val="24"/>
+        </w:rPr>
+        <w:t xml:space="preserve">Hạch toán độc lập</w:t>
+      </w:r>
+    </w:p>
+    <w:p>
+      <w:pPr>
+        <w:spacing w:before="120"/>
+      </w:pPr>
+      <w:r>
+        <w:rPr>
+          <w:rFonts w:ascii="Arial" w:hAnsi="Arial" w:cs="Arial"/>
+          <w:sz w:val="24"/>
+          <w:sz-cs w:val="24"/>
+        </w:rPr>
+        <w:t>{chk_ht_doc_lap}</w:t>
+      </w:r>
+    </w:p>
+    <w:p>
+      <w:pPr>
+        <w:spacing w:before="120"/>
+      </w:pPr>
+      <w:r>
+        <w:rPr>
+          <w:rFonts w:ascii="Arial" w:hAnsi="Arial" w:cs="Arial"/>
+          <w:sz w:val="24"/>
+          <w:sz-cs w:val="24"/>
+        </w:rPr>
+        <w:t xml:space="preserve"/>
+      </w:r>
+    </w:p>
+    <w:p>
+      <w:pPr>
+        <w:spacing w:before="120"/>
+      </w:pPr>
+      <w:r>
+        <w:rPr>
+          <w:rFonts w:ascii="Arial" w:hAnsi="Arial" w:cs="Arial"/>
+          <w:sz w:val="24"/>
+          <w:sz-cs w:val="24"/>
+        </w:rPr>
+        <w:t>Có báo cáo tài chính hợp nhất {chk_ht_hop_nhat}</w:t>
+      </w:r>
+    </w:p>
+    <w:p>
+      <w:pPr>
+        <w:spacing w:after="120"/>
+      </w:pPr>
+      <w:r>
+        <w:rPr>
+          <w:rFonts w:ascii="Arial" w:hAnsi="Arial" w:cs="Arial"/>
+          <w:sz w:val="24"/>
+          <w:sz-cs w:val="24"/>
+        </w:rPr>
+        <w:t xml:space="preserve"/>
+      </w:r>
+    </w:p>
+    <w:p>
+      <w:pPr>
+        <w:spacing w:before="120"/>
+      </w:pPr>
+      <w:r>
+        <w:rPr>
+          <w:rFonts w:ascii="Arial" w:hAnsi="Arial" w:cs="Arial"/>
+          <w:sz w:val="24"/>
+          <w:sz-cs w:val="24"/>
+        </w:rPr>
+        <w:t xml:space="preserve">Hạch toán phụ thuộc</w:t>
+      </w:r>
+    </w:p>
+    <w:p>
+      <w:pPr>
+        <w:spacing w:before="120"/>
+      </w:pPr>
+      <w:r>
+        <w:rPr>
+          <w:rFonts w:ascii="Arial" w:hAnsi="Arial" w:cs="Arial"/>
+          <w:sz w:val="24"/>
+          <w:sz-cs w:val="24"/>
+        </w:rPr>
+        <w:t>{chk_ht_phu_thuoc}</w:t>
+      </w:r>
+    </w:p>
+    <w:p>
+      <w:pPr>
+        <w:spacing w:before="120"/>
+      </w:pPr>
+      <w:r>
+        <w:rPr>
+          <w:rFonts w:ascii="Arial" w:hAnsi="Arial" w:cs="Arial"/>
+          <w:sz w:val="24"/>
+          <w:sz-cs w:val="24"/>
+        </w:rPr>
+        <w:t xml:space="preserve"/>
+      </w:r>
+    </w:p>
+    <w:p>
+      <w:pPr>
+        <w:spacing w:before="120"/>
+      </w:pPr>
+      <w:r>
+        <w:rPr>
+          <w:rFonts w:ascii="Arial" w:hAnsi="Arial" w:cs="Arial"/>
+          <w:sz w:val="24"/>
+          <w:sz-cs w:val="24"/>
+        </w:rPr>
+        <w:t xml:space="preserve"/>
+      </w:r>
+    </w:p>
+    <w:p>
+      <w:pPr>
+        <w:spacing w:after="120"/>
+      </w:pPr>
+      <w:r>
+        <w:rPr>
+          <w:rFonts w:ascii="Arial" w:hAnsi="Arial" w:cs="Arial"/>
+          <w:sz w:val="24"/>
+          <w:sz-cs w:val="24"/>
+        </w:rPr>
+        <w:t xml:space="preserve"/>
+      </w:r>
+    </w:p>
+    <w:p>
+      <w:pPr>
+        <w:spacing w:before="120"/>
+      </w:pPr>
+      <w:r>
+        <w:rPr>
+          <w:rFonts w:ascii="Arial" w:hAnsi="Arial" w:cs="Arial"/>
+          <w:sz w:val="24"/>
+          <w:sz-cs w:val="24"/>
+        </w:rPr>
+        <w:t xml:space="preserve"/>
+      </w:r>
+    </w:p>
+    <w:p>
+      <w:pPr>
+        <w:jc w:val="center"/>
+        <w:spacing w:before="120"/>
+      </w:pPr>
+      <w:r>
+        <w:rPr>
+          <w:rFonts w:ascii="Arial" w:hAnsi="Arial" w:cs="Arial"/>
+          <w:sz w:val="24"/>
+          <w:sz-cs w:val="24"/>
+        </w:rPr>
+        <w:t xml:space="preserve">9.6</w:t>
+      </w:r>
+    </w:p>
+    <w:p>
+      <w:pPr>
+        <w:spacing w:before="120"/>
+      </w:pPr>
+      <w:r>
+        <w:rPr>
+          <w:rFonts w:ascii="Arial" w:hAnsi="Arial" w:cs="Arial"/>
+          <w:sz w:val="24"/>
+          <w:sz-cs w:val="24"/>
+        </w:rPr>
+        <w:t xml:space="preserve">Năm tài chính:</w:t>
+      </w:r>
+    </w:p>
+    <w:p>
+      <w:pPr>
+        <w:spacing w:before="120"/>
+      </w:pPr>
+      <w:r>
+        <w:rPr>
+          <w:rFonts w:ascii="Arial" w:hAnsi="Arial" w:cs="Arial"/>
+          <w:sz w:val="24"/>
+          <w:sz-cs w:val="24"/>
+        </w:rPr>
+        <w:t>Áp dụng từ ngày {ap_dung_tu}/…..</w:t>
+      </w:r>
+      <w:r>
+        <w:rPr>
+          <w:rFonts w:ascii="Arial" w:hAnsi="Arial" w:cs="Arial"/>
+          <w:sz w:val="24"/>
+          <w:sz-cs w:val="24"/>
+          <w:vertAlign w:val="superscript"/>
+        </w:rPr>
+        <w:t>7</w:t>
+      </w:r>
+    </w:p>
+    <w:p>
+      <w:pPr>
+        <w:spacing w:before="120"/>
+      </w:pPr>
+      <w:r>
+        <w:rPr>
+          <w:rFonts w:ascii="Arial" w:hAnsi="Arial" w:cs="Arial"/>
+          <w:sz w:val="24"/>
+          <w:sz-cs w:val="24"/>
+        </w:rPr>
+        <w:t xml:space="preserve">(</w:t>
+      </w:r>
+      <w:r>
+        <w:rPr>
+          <w:rFonts w:ascii="Arial" w:hAnsi="Arial" w:cs="Arial"/>
+          <w:sz w:val="24"/>
+          <w:sz-cs w:val="24"/>
+          <w:i/>
+        </w:rPr>
+        <w:t xml:space="preserve">ghi ngày, tháng bắt đầu và kết thúc niên độ kế toán</w:t>
+      </w:r>
+      <w:r>
+        <w:rPr>
+          <w:rFonts w:ascii="Arial" w:hAnsi="Arial" w:cs="Arial"/>
+          <w:sz w:val="24"/>
+          <w:sz-cs w:val="24"/>
+        </w:rPr>
+        <w:t xml:space="preserve">)</w:t>
+      </w:r>
+    </w:p>
+    <w:p>
+      <w:pPr>
+        <w:jc w:val="center"/>
+        <w:spacing w:before="120"/>
+      </w:pPr>
+      <w:r>
+        <w:rPr>
+          <w:rFonts w:ascii="Arial" w:hAnsi="Arial" w:cs="Arial"/>
+          <w:sz w:val="24"/>
+          <w:sz-cs w:val="24"/>
+        </w:rPr>
+        <w:t xml:space="preserve">9.7</w:t>
+      </w:r>
+    </w:p>
+    <w:p>
+      <w:pPr>
+        <w:spacing w:before="120"/>
+      </w:pPr>
+      <w:r>
+        <w:rPr>
+          <w:rFonts w:ascii="Arial" w:hAnsi="Arial" w:cs="Arial"/>
+          <w:sz w:val="24"/>
+          <w:sz-cs w:val="24"/>
+        </w:rPr>
+        <w:t>Tổng số lao động (</w:t>
+      </w:r>
+      <w:r>
+        <w:rPr>
+          <w:rFonts w:ascii="Arial" w:hAnsi="Arial" w:cs="Arial"/>
+          <w:sz w:val="24"/>
+          <w:sz-cs w:val="24"/>
+          <w:i/>
+        </w:rPr>
+        <w:t>dự kiến</w:t>
+      </w:r>
+      <w:r>
+        <w:rPr>
+          <w:rFonts w:ascii="Arial" w:hAnsi="Arial" w:cs="Arial"/>
+          <w:sz w:val="24"/>
+          <w:sz-cs w:val="24"/>
+        </w:rPr>
+        <w:t xml:space="preserve">): {so_lao_dong} </w:t>
+      </w:r>
+    </w:p>
+    <w:p>
+      <w:pPr>
+        <w:jc w:val="center"/>
+        <w:spacing w:before="120"/>
+      </w:pPr>
+      <w:r>
+        <w:rPr>
+          <w:rFonts w:ascii="Arial" w:hAnsi="Arial" w:cs="Arial"/>
+          <w:sz w:val="24"/>
+          <w:sz-cs w:val="24"/>
+        </w:rPr>
+        <w:t xml:space="preserve">9.8</w:t>
+      </w:r>
+    </w:p>
+    <w:p>
+      <w:pPr>
+        <w:spacing w:before="120"/>
+      </w:pPr>
+      <w:r>
+        <w:rPr>
+          <w:rFonts w:ascii="Arial" w:hAnsi="Arial" w:cs="Arial"/>
+          <w:sz w:val="24"/>
+          <w:sz-cs w:val="24"/>
+        </w:rPr>
+        <w:t xml:space="preserve">Hoạt động theo dự án BOT/BTO/BT/BOO, BLT, BTL, O&amp;M:</w:t>
+      </w:r>
+    </w:p>
+    <w:p>
+      <w:pPr>
+        <w:spacing w:before="120"/>
+      </w:pPr>
+      <w:r>
+        <w:rPr>
+          <w:rFonts w:ascii="Arial" w:hAnsi="Arial" w:cs="Arial"/>
+          <w:sz w:val="24"/>
+          <w:sz-cs w:val="24"/>
+        </w:rPr>
+        <w:t>Có {chk_co}</w:t>
+      </w:r>
+    </w:p>
+    <w:p>
+      <w:pPr>
+        <w:spacing w:before="120"/>
+      </w:pPr>
+      <w:r>
+        <w:rPr>
+          <w:rFonts w:ascii="Arial" w:hAnsi="Arial" w:cs="Arial"/>
+          <w:sz w:val="24"/>
+          <w:sz-cs w:val="24"/>
+        </w:rPr>
+        <w:t>Không {chk_khong}</w:t>
+      </w:r>
+    </w:p>
+    <w:p>
+      <w:pPr>
+        <w:spacing w:after="120"/>
+      </w:pPr>
+      <w:r>
+        <w:rPr>
+          <w:rFonts w:ascii="Arial" w:hAnsi="Arial" w:cs="Arial"/>
+          <w:sz w:val="24"/>
+          <w:sz-cs w:val="24"/>
+        </w:rPr>
+        <w:t xml:space="preserve"/>
+      </w:r>
+    </w:p>
+    <w:p>
+      <w:pPr>
+        <w:spacing w:before="120"/>
+      </w:pPr>
+      <w:r>
+        <w:rPr>
+          <w:rFonts w:ascii="Arial" w:hAnsi="Arial" w:cs="Arial"/>
+          <w:sz w:val="24"/>
+          <w:sz-cs w:val="24"/>
+        </w:rPr>
+        <w:t xml:space="preserve"/>
+      </w:r>
+    </w:p>
+    <w:p>
+      <w:pPr>
+        <w:spacing w:before="120"/>
+      </w:pPr>
+      <w:r>
+        <w:rPr>
+          <w:rFonts w:ascii="Arial" w:hAnsi="Arial" w:cs="Arial"/>
+          <w:sz w:val="24"/>
+          <w:sz-cs w:val="24"/>
+        </w:rPr>
+        <w:t xml:space="preserve">9.9</w:t>
+      </w:r>
+    </w:p>
+    <w:p>
+      <w:pPr>
+        <w:spacing w:before="120"/>
+      </w:pPr>
+      <w:r>
+        <w:rPr>
+          <w:rFonts w:ascii="Arial" w:hAnsi="Arial" w:cs="Arial"/>
+          <w:sz w:val="24"/>
+          <w:sz-cs w:val="24"/>
+        </w:rPr>
+        <w:t xml:space="preserve">Phương pháp tính thuế GTGT (</w:t>
+      </w:r>
+      <w:r>
+        <w:rPr>
+          <w:rFonts w:ascii="Arial" w:hAnsi="Arial" w:cs="Arial"/>
+          <w:sz w:val="24"/>
+          <w:sz-cs w:val="24"/>
+          <w:i/>
+        </w:rPr>
+        <w:t xml:space="preserve">chọn 1 trong 4 phương pháp</w:t>
+      </w:r>
+      <w:r>
+        <w:rPr>
+          <w:rFonts w:ascii="Arial" w:hAnsi="Arial" w:cs="Arial"/>
+          <w:sz w:val="24"/>
+          <w:sz-cs w:val="24"/>
+        </w:rPr>
+        <w:t xml:space="preserve">)</w:t>
+      </w:r>
+      <w:r>
+        <w:rPr>
+          <w:rFonts w:ascii="Arial" w:hAnsi="Arial" w:cs="Arial"/>
+          <w:sz w:val="24"/>
+          <w:sz-cs w:val="24"/>
+          <w:vertAlign w:val="superscript"/>
+        </w:rPr>
+        <w:t xml:space="preserve">8</w:t>
+      </w:r>
+      <w:r>
+        <w:rPr>
+          <w:rFonts w:ascii="Arial" w:hAnsi="Arial" w:cs="Arial"/>
+          <w:sz w:val="24"/>
+          <w:sz-cs w:val="24"/>
+        </w:rPr>
+        <w:t xml:space="preserve">:</w:t>
+      </w:r>
+    </w:p>
+    <w:p>
+      <w:pPr>
+        <w:spacing w:after="120"/>
+      </w:pPr>
+      <w:r>
+        <w:rPr>
+          <w:rFonts w:ascii="Arial" w:hAnsi="Arial" w:cs="Arial"/>
+          <w:sz w:val="24"/>
+          <w:sz-cs w:val="24"/>
+        </w:rPr>
+        <w:t xml:space="preserve"/>
+      </w:r>
+    </w:p>
+    <w:p>
+      <w:pPr>
+        <w:spacing w:before="120"/>
+      </w:pPr>
+      <w:r>
+        <w:rPr>
+          <w:rFonts w:ascii="Arial" w:hAnsi="Arial" w:cs="Arial"/>
+          <w:sz w:val="24"/>
+          <w:sz-cs w:val="24"/>
+        </w:rPr>
+        <w:t xml:space="preserve">Khấu trừ</w:t>
+      </w:r>
+    </w:p>
+    <w:p>
+      <w:pPr>
+        <w:spacing w:before="120"/>
+      </w:pPr>
+      <w:r>
+        <w:rPr>
+          <w:rFonts w:ascii="Arial" w:hAnsi="Arial" w:cs="Arial"/>
+          <w:sz w:val="24"/>
+          <w:sz-cs w:val="24"/>
+        </w:rPr>
+        <w:t>{chk_gtgt_khoan_tru}</w:t>
+      </w:r>
+    </w:p>
+    <w:p>
+      <w:pPr>
+        <w:spacing w:after="120"/>
+      </w:pPr>
+      <w:r>
+        <w:rPr>
+          <w:rFonts w:ascii="Arial" w:hAnsi="Arial" w:cs="Arial"/>
+          <w:sz w:val="24"/>
+          <w:sz-cs w:val="24"/>
+        </w:rPr>
+        <w:t xml:space="preserve"/>
+      </w:r>
+    </w:p>
+    <w:p>
+      <w:pPr>
+        <w:spacing w:before="120"/>
+      </w:pPr>
+      <w:r>
+        <w:rPr>
+          <w:rFonts w:ascii="Arial" w:hAnsi="Arial" w:cs="Arial"/>
+          <w:sz w:val="24"/>
+          <w:sz-cs w:val="24"/>
+        </w:rPr>
+        <w:t xml:space="preserve">Trực tiếp trên GTGT</w:t>
+      </w:r>
+    </w:p>
+    <w:p>
+      <w:pPr>
+        <w:spacing w:before="120"/>
+      </w:pPr>
+      <w:r>
+        <w:rPr>
+          <w:rFonts w:ascii="Arial" w:hAnsi="Arial" w:cs="Arial"/>
+          <w:sz w:val="24"/>
+          <w:sz-cs w:val="24"/>
+        </w:rPr>
+        <w:t>{chk_gtgt_truc_tiep_tren_gtgt}</w:t>
+      </w:r>
+    </w:p>
+    <w:p>
+      <w:pPr>
+        <w:spacing w:after="120"/>
+      </w:pPr>
+      <w:r>
+        <w:rPr>
+          <w:rFonts w:ascii="Arial" w:hAnsi="Arial" w:cs="Arial"/>
+          <w:sz w:val="24"/>
+          <w:sz-cs w:val="24"/>
+        </w:rPr>
+        <w:t xml:space="preserve"/>
+      </w:r>
+    </w:p>
+    <w:p>
+      <w:pPr>
+        <w:spacing w:before="120"/>
+      </w:pPr>
+      <w:r>
+        <w:rPr>
+          <w:rFonts w:ascii="Arial" w:hAnsi="Arial" w:cs="Arial"/>
+          <w:sz w:val="24"/>
+          <w:sz-cs w:val="24"/>
+        </w:rPr>
+        <w:t xml:space="preserve">Trực tiếp trên doanh số</w:t>
+      </w:r>
+    </w:p>
+    <w:p>
+      <w:pPr>
+        <w:spacing w:before="120"/>
+      </w:pPr>
+      <w:r>
+        <w:rPr>
+          <w:rFonts w:ascii="Arial" w:hAnsi="Arial" w:cs="Arial"/>
+          <w:sz w:val="24"/>
+          <w:sz-cs w:val="24"/>
+        </w:rPr>
+        <w:t>{chk_gtgt_truc_tiep_doanh_so}</w:t>
+      </w:r>
+    </w:p>
+    <w:p>
+      <w:pPr>
+        <w:spacing w:after="120"/>
+      </w:pPr>
+      <w:r>
+        <w:rPr>
+          <w:rFonts w:ascii="Arial" w:hAnsi="Arial" w:cs="Arial"/>
+          <w:sz w:val="24"/>
+          <w:sz-cs w:val="24"/>
+        </w:rPr>
+        <w:t xml:space="preserve"/>
+      </w:r>
+    </w:p>
+    <w:p>
+      <w:pPr>
+        <w:spacing w:before="120"/>
+      </w:pPr>
+      <w:r>
+        <w:rPr>
+          <w:rFonts w:ascii="Arial" w:hAnsi="Arial" w:cs="Arial"/>
+          <w:sz w:val="24"/>
+          <w:sz-cs w:val="24"/>
+        </w:rPr>
+        <w:t xml:space="preserve">Không phải nộp thuế GTGT</w:t>
+      </w:r>
+    </w:p>
+    <w:p>
+      <w:pPr>
+        <w:spacing w:before="120"/>
+      </w:pPr>
+      <w:r>
+        <w:rPr>
+          <w:rFonts w:ascii="Arial" w:hAnsi="Arial" w:cs="Arial"/>
+          <w:sz w:val="24"/>
+          <w:sz-cs w:val="24"/>
+        </w:rPr>
+        <w:t>{chk_gtgt_khong_phai_nop}</w:t>
+      </w:r>
+    </w:p>
+    <w:p>
+      <w:pPr>
+        <w:spacing w:after="120"/>
+      </w:pPr>
+      <w:r>
+        <w:rPr>
+          <w:rFonts w:ascii="Arial" w:hAnsi="Arial" w:cs="Arial"/>
+          <w:sz w:val="24"/>
+          <w:sz-cs w:val="24"/>
+        </w:rPr>
+        <w:t xml:space="preserve"/>
+      </w:r>
+    </w:p>
+    <w:p>
+      <w:pPr>
+        <w:spacing w:before="120"/>
+      </w:pPr>
+      <w:r>
+        <w:rPr>
+          <w:rFonts w:ascii="Arial" w:hAnsi="Arial" w:cs="Arial"/>
+          <w:sz w:val="24"/>
+          <w:sz-cs w:val="24"/>
+        </w:rPr>
+        <w:t xml:space="preserve"/>
+      </w:r>
+    </w:p>
+    <w:p>
+      <w:pPr>
+        <w:spacing w:before="120"/>
+      </w:pPr>
+      <w:r>
+        <w:rPr>
+          <w:rFonts w:ascii="Arial" w:hAnsi="Arial" w:cs="Arial"/>
+          <w:sz w:val="24"/>
+          <w:sz-cs w:val="24"/>
+          <w:b/>
+        </w:rPr>
+        <w:t xml:space="preserve">10. Thông tin về việc đóng bảo hiểm xã hội</w:t>
+      </w:r>
+      <w:r>
+        <w:rPr>
+          <w:rFonts w:ascii="Arial" w:hAnsi="Arial" w:cs="Arial"/>
+          <w:sz w:val="24"/>
+          <w:sz-cs w:val="24"/>
+          <w:b/>
+          <w:vertAlign w:val="superscript"/>
+        </w:rPr>
+        <w:t xml:space="preserve">9</w:t>
+      </w:r>
+      <w:r>
+        <w:rPr>
+          <w:rFonts w:ascii="Arial" w:hAnsi="Arial" w:cs="Arial"/>
+          <w:sz w:val="24"/>
+          <w:sz-cs w:val="24"/>
+          <w:b/>
+        </w:rPr>
+        <w:t xml:space="preserve">:</w:t>
+      </w:r>
+    </w:p>
+    <w:p>
+      <w:pPr>
+        <w:spacing w:before="120"/>
+      </w:pPr>
+      <w:r>
+        <w:rPr>
+          <w:rFonts w:ascii="Arial" w:hAnsi="Arial" w:cs="Arial"/>
+          <w:sz w:val="24"/>
+          <w:sz-cs w:val="24"/>
+        </w:rPr>
+        <w:t xml:space="preserve">Phương thức đóng bảo hiểm xã hội</w:t>
+      </w:r>
+      <w:r>
+        <w:rPr>
+          <w:rFonts w:ascii="Arial" w:hAnsi="Arial" w:cs="Arial"/>
+          <w:sz w:val="24"/>
+          <w:sz-cs w:val="24"/>
+          <w:b/>
+        </w:rPr>
+        <w:t xml:space="preserve"> </w:t>
+      </w:r>
+      <w:r>
+        <w:rPr>
+          <w:rFonts w:ascii="Arial" w:hAnsi="Arial" w:cs="Arial"/>
+          <w:sz w:val="24"/>
+          <w:sz-cs w:val="24"/>
+        </w:rPr>
+        <w:t xml:space="preserve">(</w:t>
+      </w:r>
+      <w:r>
+        <w:rPr>
+          <w:rFonts w:ascii="Arial" w:hAnsi="Arial" w:cs="Arial"/>
+          <w:sz w:val="24"/>
+          <w:sz-cs w:val="24"/>
+          <w:i/>
+        </w:rPr>
+        <w:t xml:space="preserve">chọn 1 trong 3 phương thức</w:t>
+      </w:r>
+      <w:r>
+        <w:rPr>
+          <w:rFonts w:ascii="Arial" w:hAnsi="Arial" w:cs="Arial"/>
+          <w:sz w:val="24"/>
+          <w:sz-cs w:val="24"/>
+        </w:rPr>
+        <w:t xml:space="preserve">):</w:t>
+      </w:r>
+    </w:p>
+    <w:p>
+      <w:pPr>
+        <w:spacing w:before="120"/>
+      </w:pPr>
+      <w:r>
+        <w:rPr>
+          <w:rFonts w:ascii="Arial" w:hAnsi="Arial" w:cs="Arial"/>
+          <w:sz w:val="24"/>
+          <w:sz-cs w:val="24"/>
+        </w:rPr>
+        <w:t>{chk_bc_hang_thang} Hàng tháng</w:t>
+      </w:r>
+    </w:p>
+    <w:p>
+      <w:pPr>
+        <w:spacing w:before="120"/>
+      </w:pPr>
+      <w:r>
+        <w:rPr>
+          <w:rFonts w:ascii="Arial" w:hAnsi="Arial" w:cs="Arial"/>
+          <w:sz w:val="24"/>
+          <w:sz-cs w:val="24"/>
+        </w:rPr>
+        <w:t>{chk_bc_03_thang} 03 tháng một lần</w:t>
+      </w:r>
+    </w:p>
+    <w:p>
+      <w:pPr>
+        <w:spacing w:before="120"/>
+      </w:pPr>
+      <w:r>
+        <w:rPr>
+          <w:rFonts w:ascii="Arial" w:hAnsi="Arial" w:cs="Arial"/>
+          <w:sz w:val="24"/>
+          <w:sz-cs w:val="24"/>
+        </w:rPr>
+        <w:t>{chk_bc_06_thang} 06 tháng một lần</w:t>
+      </w:r>
+    </w:p>
+    <w:p>
+      <w:pPr>
+        <w:spacing w:before="120"/>
+      </w:pPr>
+      <w:r>
+        <w:rPr>
+          <w:rFonts w:ascii="Arial" w:hAnsi="Arial" w:cs="Arial"/>
+          <w:sz w:val="24"/>
+          <w:sz-cs w:val="24"/>
+          <w:b/>
+          <w:i/>
+        </w:rPr>
+        <w:t xml:space="preserve">Lưu ý: </w:t>
+      </w:r>
+    </w:p>
+    <w:p>
+      <w:pPr>
+        <w:spacing w:before="120"/>
+      </w:pPr>
+      <w:r>
+        <w:rPr>
+          <w:rFonts w:ascii="Arial" w:hAnsi="Arial" w:cs="Arial"/>
+          <w:sz w:val="24"/>
+          <w:sz-cs w:val="24"/>
+        </w:rPr>
+        <w:t xml:space="preserve">- Doanh nghiệp đăng ký ngành, nghề kinh doanh chính là nông nghiệp, lâm nghiệp, ngư nghiệp, diêm nghiệp và trả lương theo sản phẩm, theo khoán: có thể lựa chọn 1 trong 3 phương thức đóng bảo hiểm xã hội: hàng tháng, 03 tháng một lần, 06 tháng một lần.</w:t>
+      </w:r>
+    </w:p>
+    <w:p>
+      <w:pPr>
+        <w:spacing w:before="120"/>
+      </w:pPr>
+      <w:r>
+        <w:rPr>
+          <w:rFonts w:ascii="Arial" w:hAnsi="Arial" w:cs="Arial"/>
+          <w:sz w:val="24"/>
+          <w:sz-cs w:val="24"/>
+        </w:rPr>
+        <w:t xml:space="preserve">- Doanh nghiệp đăng ký ngành, nghề kinh doanh chính khác: đánh dấu vào phương thức đóng bảo hiểm xã hội hàng tháng.</w:t>
+      </w:r>
+    </w:p>
+    <w:p>
+      <w:pPr>
+        <w:spacing w:before="120"/>
+      </w:pPr>
+      <w:r>
+        <w:rPr>
+          <w:rFonts w:ascii="Arial" w:hAnsi="Arial" w:cs="Arial"/>
+          <w:sz w:val="24"/>
+          <w:sz-cs w:val="24"/>
+          <w:b/>
+        </w:rPr>
+        <w:t xml:space="preserve">11. Thông tin về chủ sở hữu hưởng lợi của doanh nghiệp</w:t>
+      </w:r>
+      <w:r>
+        <w:rPr>
+          <w:rFonts w:ascii="Arial" w:hAnsi="Arial" w:cs="Arial"/>
+          <w:sz w:val="24"/>
+          <w:sz-cs w:val="24"/>
+          <w:vertAlign w:val="superscript"/>
+        </w:rPr>
+        <w:t xml:space="preserve">10</w:t>
+      </w:r>
+      <w:r>
+        <w:rPr>
+          <w:rFonts w:ascii="Arial" w:hAnsi="Arial" w:cs="Arial"/>
+          <w:sz w:val="24"/>
+          <w:sz-cs w:val="24"/>
+          <w:b/>
+        </w:rPr>
+        <w:t xml:space="preserve">:</w:t>
+      </w:r>
+      <w:r>
+        <w:rPr>
+          <w:rFonts w:ascii="Arial" w:hAnsi="Arial" w:cs="Arial"/>
+          <w:sz w:val="24"/>
+          <w:sz-cs w:val="24"/>
+        </w:rPr>
+        <w:t xml:space="preserve"/>
+      </w:r>
+    </w:p>
+    <w:p>
+      <w:pPr>
+        <w:spacing w:before="120"/>
+      </w:pPr>
+      <w:r>
+        <w:rPr>
+          <w:rFonts w:ascii="Arial" w:hAnsi="Arial" w:cs="Arial"/>
+          <w:sz w:val="24"/>
+          <w:sz-cs w:val="24"/>
+        </w:rPr>
+        <w:t xml:space="preserve">Doanh nghiệp có chủ sở hữu hưởng lợi không?</w:t>
+      </w:r>
+    </w:p>
+    <w:p>
+      <w:pPr>
+        <w:spacing w:before="120"/>
+      </w:pPr>
+      <w:r>
+        <w:rPr>
+          <w:rFonts w:ascii="Arial" w:hAnsi="Arial" w:cs="Arial"/>
+          <w:sz w:val="24"/>
+          <w:sz-cs w:val="24"/>
+        </w:rPr>
+        <w:t>{chk_co} Có</w:t>
+      </w:r>
+    </w:p>
+    <w:p>
+      <w:pPr>
+        <w:spacing w:before="120"/>
+      </w:pPr>
+      <w:r>
+        <w:rPr>
+          <w:rFonts w:ascii="Arial" w:hAnsi="Arial" w:cs="Arial"/>
+          <w:sz w:val="24"/>
+          <w:sz-cs w:val="24"/>
+        </w:rPr>
+        <w:t xml:space="preserve"> {chk_khong} Không</w:t>
+      </w:r>
+    </w:p>
+    <w:p>
+      <w:pPr>
+        <w:spacing w:before="120"/>
+      </w:pPr>
+      <w:r>
+        <w:rPr>
+          <w:rFonts w:ascii="Arial" w:hAnsi="Arial" w:cs="Arial"/>
+          <w:sz w:val="24"/>
+          <w:sz-cs w:val="24"/>
+        </w:rPr>
+        <w:t xml:space="preserve">Trường hợp hồ sơ đăng ký doanh nghiệp hợp lệ, đề nghị Quý Cơ quan đăng công bố nội dung đăng ký doanh nghiệp trên Cổng thông tin quốc gia về đăng ký doanh nghiệp.</w:t>
+      </w:r>
+    </w:p>
+    <w:p>
+      <w:pPr>
+        <w:spacing w:before="120"/>
+      </w:pPr>
+      <w:r>
+        <w:rPr>
+          <w:rFonts w:ascii="Arial" w:hAnsi="Arial" w:cs="Arial"/>
+          <w:sz w:val="24"/>
+          <w:sz-cs w:val="24"/>
+        </w:rPr>
+        <w:t xml:space="preserve">Tôi cam kết:</w:t>
+      </w:r>
+    </w:p>
+    <w:p>
+      <w:pPr>
+        <w:spacing w:before="120"/>
+      </w:pPr>
+      <w:r>
+        <w:rPr>
+          <w:rFonts w:ascii="Arial" w:hAnsi="Arial" w:cs="Arial"/>
+          <w:sz w:val="24"/>
+          <w:sz-cs w:val="24"/>
+        </w:rPr>
+        <w:t xml:space="preserve">- Là người có đầy đủ quyền và nghĩa vụ thực hiện thủ tục đăng ký doanh nghiệp theo quy định của pháp luật và Điều lệ công ty;</w:t>
+      </w:r>
+    </w:p>
+    <w:p>
+      <w:pPr>
+        <w:spacing w:before="120"/>
+      </w:pPr>
+      <w:r>
+        <w:rPr>
+          <w:rFonts w:ascii="Arial" w:hAnsi="Arial" w:cs="Arial"/>
+          <w:sz w:val="24"/>
+          <w:sz-cs w:val="24"/>
+        </w:rPr>
+        <w:t xml:space="preserve">- Trụ sở chính thuộc quyền sử dụng hợp pháp của công ty và được sử dụng đúng mục đích theo quy định của pháp luật;</w:t>
+      </w:r>
+    </w:p>
+    <w:p>
+      <w:pPr>
+        <w:spacing w:before="120"/>
+      </w:pPr>
+      <w:r>
+        <w:rPr>
+          <w:rFonts w:ascii="Arial" w:hAnsi="Arial" w:cs="Arial"/>
+          <w:sz w:val="24"/>
+          <w:sz-cs w:val="24"/>
+        </w:rPr>
+        <w:t xml:space="preserve">- Chịu trách nhiệm trước pháp luật về tính hợp pháp, chính xác và trung thực của nội dung đăng ký doanh nghiệp trên.</w:t>
+      </w:r>
+    </w:p>
+    <w:p>
+      <w:pPr>
+        <w:spacing w:before="120"/>
+      </w:pPr>
+      <w:r>
+        <w:rPr>
+          <w:rFonts w:ascii="Arial" w:hAnsi="Arial" w:cs="Arial"/>
+          <w:sz w:val="24"/>
+          <w:sz-cs w:val="24"/>
+        </w:rPr>
+        <w:t xml:space="preserve"/>
+      </w:r>
+    </w:p>
+    <w:p>
+      <w:pPr>
+        <w:spacing w:before="120"/>
+      </w:pPr>
+      <w:r>
+        <w:rPr>
+          <w:rFonts w:ascii="Arial" w:hAnsi="Arial" w:cs="Arial"/>
+          <w:sz w:val="24"/>
+          <w:sz-cs w:val="24"/>
+        </w:rPr>
+        <w:t xml:space="preserve"/>
+      </w:r>
+    </w:p>
+    <w:p>
+      <w:pPr>
+        <w:jc w:val="center"/>
+        <w:spacing w:before="120"/>
+      </w:pPr>
+      <w:r>
+        <w:rPr>
+          <w:rFonts w:ascii="Arial" w:hAnsi="Arial" w:cs="Arial"/>
+          <w:sz w:val="24"/>
+          <w:sz-cs w:val="24"/>
+          <w:b/>
+        </w:rPr>
+        <w:t xml:space="preserve">NGƯỜI ĐẠI DIỆN THEO PHÁP LUẬT/</w:t>
+        <w:br/>
+        <w:t xml:space="preserve">CHỦ TỊCH HỘI ĐỒNG THÀNH VIÊN CỦA CÔNG TY</w:t>
+        <w:br/>
+        <w:t xml:space="preserve"/>
+      </w:r>
+      <w:r>
+        <w:rPr>
+          <w:rFonts w:ascii="Arial" w:hAnsi="Arial" w:cs="Arial"/>
+          <w:sz w:val="24"/>
+          <w:sz-cs w:val="24"/>
+        </w:rPr>
+        <w:t xml:space="preserve">(</w:t>
+      </w:r>
+      <w:r>
+        <w:rPr>
+          <w:rFonts w:ascii="Arial" w:hAnsi="Arial" w:cs="Arial"/>
+          <w:sz w:val="24"/>
+          <w:sz-cs w:val="24"/>
+          <w:i/>
+        </w:rPr>
+        <w:t xml:space="preserve">Ký và ghi họ tên</w:t>
+      </w:r>
+      <w:r>
+        <w:rPr>
+          <w:rFonts w:ascii="Arial" w:hAnsi="Arial" w:cs="Arial"/>
+          <w:sz w:val="24"/>
+          <w:sz-cs w:val="24"/>
+        </w:rPr>
+        <w:t xml:space="preserve">)</w:t>
+      </w:r>
+      <w:r>
+        <w:rPr>
+          <w:rFonts w:ascii="Arial" w:hAnsi="Arial" w:cs="Arial"/>
+          <w:sz w:val="24"/>
+          <w:sz-cs w:val="24"/>
+          <w:vertAlign w:val="superscript"/>
+        </w:rPr>
+        <w:t xml:space="preserve">11</w:t>
+      </w:r>
+      <w:r>
+        <w:rPr>
+          <w:rFonts w:ascii="Arial" w:hAnsi="Arial" w:cs="Arial"/>
+          <w:sz w:val="24"/>
+          <w:sz-cs w:val="24"/>
+          <w:b/>
+        </w:rPr>
+        <w:t xml:space="preserve"/>
+      </w:r>
+    </w:p>
+    <w:p>
+      <w:pPr>
+        <w:spacing w:before="120"/>
+      </w:pPr>
+      <w:r>
+        <w:rPr>
+          <w:rFonts w:ascii="Arial" w:hAnsi="Arial" w:cs="Arial"/>
+          <w:sz w:val="24"/>
+          <w:sz-cs w:val="24"/>
+        </w:rPr>
+        <w:t xml:space="preserve">_______________________</w:t>
+      </w:r>
+    </w:p>
+    <w:p>
+      <w:pPr>
+        <w:spacing w:before="120"/>
+      </w:pPr>
+      <w:r>
+        <w:rPr>
+          <w:rFonts w:ascii="Arial" w:hAnsi="Arial" w:cs="Arial"/>
+          <w:sz w:val="24"/>
+          <w:sz-cs w:val="24"/>
+          <w:vertAlign w:val="superscript"/>
+        </w:rPr>
+        <w:t xml:space="preserve">1 </w:t>
+      </w:r>
+      <w:r>
+        <w:rPr>
+          <w:rFonts w:ascii="Arial" w:hAnsi="Arial" w:cs="Arial"/>
+          <w:sz w:val="24"/>
+          <w:sz-cs w:val="24"/>
+        </w:rPr>
+        <w:t xml:space="preserve">Trường hợp Tòa án hoặc Trọng tài chỉ định người thực hiện thủ tục đăng ký doanh nghiệp thì người được chỉ định kê khai thông tin vào phần này.</w:t>
+      </w:r>
+    </w:p>
+    <w:p>
+      <w:pPr>
+        <w:spacing w:before="120"/>
+      </w:pPr>
+      <w:r>
+        <w:rPr>
+          <w:rFonts w:ascii="Arial" w:hAnsi="Arial" w:cs="Arial"/>
+          <w:sz w:val="24"/>
+          <w:sz-cs w:val="24"/>
+          <w:vertAlign w:val="superscript"/>
+        </w:rPr>
+        <w:t xml:space="preserve">2 </w:t>
+      </w:r>
+      <w:r>
+        <w:rPr>
+          <w:rFonts w:ascii="Arial" w:hAnsi="Arial" w:cs="Arial"/>
+          <w:sz w:val="24"/>
+          <w:sz-cs w:val="24"/>
+        </w:rPr>
+        <w:t xml:space="preserve">Trường hợp đăng ký chuyển đổi loại hình doanh nghiệp đồng thời đăng ký thay đổi người đại diện theo pháp luật thì Chủ tịch Hội đồng thành viên của công ty sau chuyển đổi kê khai thông tin vào phần này.</w:t>
+      </w:r>
+    </w:p>
+    <w:p>
+      <w:pPr>
+        <w:spacing w:before="120"/>
+      </w:pPr>
+      <w:r>
+        <w:rPr>
+          <w:rFonts w:ascii="Arial" w:hAnsi="Arial" w:cs="Arial"/>
+          <w:sz w:val="24"/>
+          <w:sz-cs w:val="24"/>
+          <w:vertAlign w:val="superscript"/>
+        </w:rPr>
+        <w:t xml:space="preserve">3 </w:t>
+      </w:r>
+      <w:r>
+        <w:rPr>
+          <w:rFonts w:ascii="Arial" w:hAnsi="Arial" w:cs="Arial"/>
+          <w:sz w:val="24"/>
+          <w:sz-cs w:val="24"/>
+        </w:rPr>
+        <w:t xml:space="preserve">Trường hợp đăng ký thành lập công ty TNHH hai thành viên</w:t>
+      </w:r>
+      <w:r>
+        <w:rPr>
+          <w:rFonts w:ascii="Arial" w:hAnsi="Arial" w:cs="Arial"/>
+          <w:sz w:val="24"/>
+          <w:sz-cs w:val="24"/>
+          <w:b/>
+        </w:rPr>
+        <w:t xml:space="preserve"> </w:t>
+      </w:r>
+      <w:r>
+        <w:rPr>
+          <w:rFonts w:ascii="Arial" w:hAnsi="Arial" w:cs="Arial"/>
+          <w:sz w:val="24"/>
+          <w:sz-cs w:val="24"/>
+        </w:rPr>
+        <w:t xml:space="preserve">trở lên trên cơ sở chuyển đổi từ cơ sở bảo trợ xã hội/quỹ xã hội/quỹ từ thiện qua mạng thông tin điện tử thì người nộp hồ sơ scan Giấy chứng nhận đăng ký thành lập (đối với cơ sở bảo trợ xã hội)/Giấy phép thành lập và công nhận điều lệ quỹ (đối với quỹ xã hội/quỹ từ thiện) trong hồ sơ đăng ký doanh nghiệp qua mạng thông tin điện tử và nộp bản chính Giấy này tới Cơ quan đăng ký kinh doanh cấp tỉnh để được cấp Giấy chứng nhận đăng ký doanh nghiệp theo quy định tại khoản 7 Điều 28 Nghị định số 168/2025/NĐ-CP ngày 30/6/2025 của Chính phủ về đăng ký doanh nghiệp.</w:t>
+      </w:r>
+    </w:p>
+    <w:p>
+      <w:pPr>
+        <w:spacing w:before="120"/>
+      </w:pPr>
+      <w:r>
+        <w:rPr>
+          <w:rFonts w:ascii="Arial" w:hAnsi="Arial" w:cs="Arial"/>
+          <w:sz w:val="24"/>
+          <w:sz-cs w:val="24"/>
+          <w:vertAlign w:val="superscript"/>
+        </w:rPr>
+        <w:t xml:space="preserve">4 </w:t>
+      </w:r>
+      <w:r>
+        <w:rPr>
+          <w:rFonts w:ascii="Arial" w:hAnsi="Arial" w:cs="Arial"/>
+          <w:sz w:val="24"/>
+          <w:sz-cs w:val="24"/>
+        </w:rPr>
+        <w:t xml:space="preserve">Kê khai trong trường hợp có nhà đầu tư nước ngoài góp vốn, mua cổ phần, phần vốn góp vào doanh nghiệp dẫn đến thay đổi nội dung đăng ký doanh nghiệp.</w:t>
+      </w:r>
+    </w:p>
+    <w:p>
+      <w:pPr>
+        <w:spacing w:before="120"/>
+      </w:pPr>
+      <w:r>
+        <w:rPr>
+          <w:rFonts w:ascii="Arial" w:hAnsi="Arial" w:cs="Arial"/>
+          <w:sz w:val="24"/>
+          <w:sz-cs w:val="24"/>
+          <w:vertAlign w:val="superscript"/>
+        </w:rPr>
+        <w:t xml:space="preserve">5</w:t>
+      </w:r>
+      <w:r>
+        <w:rPr>
+          <w:rFonts w:ascii="Arial" w:hAnsi="Arial" w:cs="Arial"/>
+          <w:sz w:val="24"/>
+          <w:sz-cs w:val="24"/>
+        </w:rPr>
+        <w:t xml:space="preserve"> Ghi thông tin của tất cả người đại diện theo pháp luật trong trường hợp công ty có nhiều hơn 01 người đại diện theo pháp luật.</w:t>
+      </w:r>
+    </w:p>
+    <w:p>
+      <w:pPr>
+        <w:spacing w:before="120"/>
+      </w:pPr>
+      <w:r>
+        <w:rPr>
+          <w:rFonts w:ascii="Arial" w:hAnsi="Arial" w:cs="Arial"/>
+          <w:sz w:val="24"/>
+          <w:sz-cs w:val="24"/>
+          <w:vertAlign w:val="superscript"/>
+        </w:rPr>
+        <w:t xml:space="preserve">6</w:t>
+      </w:r>
+      <w:r>
+        <w:rPr>
+          <w:rFonts w:ascii="Arial" w:hAnsi="Arial" w:cs="Arial"/>
+          <w:sz w:val="24"/>
+          <w:sz-cs w:val="24"/>
+        </w:rPr>
+        <w:t xml:space="preserve"> Trường hợp doanh nghiệp được cấp Giấy chứng nhận đăng ký doanh nghiệp sau ngày bắt đầu hoạt động đã kê khai thì ngày bắt đầu hoạt động là ngày doanh nghiệp được cấp Giấy chứng nhận đăng ký doanh nghiệp.</w:t>
+      </w:r>
+    </w:p>
+    <w:p>
+      <w:pPr>
+        <w:spacing w:before="120"/>
+      </w:pPr>
+      <w:r>
+        <w:rPr>
+          <w:rFonts w:ascii="Arial" w:hAnsi="Arial" w:cs="Arial"/>
+          <w:sz w:val="24"/>
+          <w:sz-cs w:val="24"/>
+          <w:vertAlign w:val="superscript"/>
+        </w:rPr>
+        <w:t xml:space="preserve">7 </w:t>
+      </w:r>
+      <w:r>
+        <w:rPr>
+          <w:rFonts w:ascii="Arial" w:hAnsi="Arial" w:cs="Arial"/>
+          <w:sz w:val="24"/>
+          <w:sz-cs w:val="24"/>
+        </w:rPr>
+        <w:t xml:space="preserve">- Trường hợp niên độ kế toán theo năm dương lịch thì ghi từ ngày 01/01 đến ngày 31/12. </w:t>
+      </w:r>
+    </w:p>
+    <w:p>
+      <w:pPr>
+        <w:spacing w:before="120"/>
+      </w:pPr>
+      <w:r>
+        <w:rPr>
+          <w:rFonts w:ascii="Arial" w:hAnsi="Arial" w:cs="Arial"/>
+          <w:sz w:val="24"/>
+          <w:sz-cs w:val="24"/>
+        </w:rPr>
+        <w:t xml:space="preserve">- Trường hợp niên độ kế toán theo năm tài chính khác năm dương lịch thì ghi ngày, tháng bắt đầu niên độ kế toán là ngày đầu tiên của quý; ngày, tháng kết thúc niên độ kế toán là ngày cuối cùng của quý. </w:t>
+      </w:r>
+    </w:p>
+    <w:p>
+      <w:pPr>
+        <w:spacing w:before="120"/>
+      </w:pPr>
+      <w:r>
+        <w:rPr>
+          <w:rFonts w:ascii="Arial" w:hAnsi="Arial" w:cs="Arial"/>
+          <w:sz w:val="24"/>
+          <w:sz-cs w:val="24"/>
+        </w:rPr>
+        <w:t xml:space="preserve">- Tổng thời gian từ ngày bắt đầu đến ngày kết thúc niên độ kế toán phải đủ 12 tháng hoặc 4 quý liên tiếp.</w:t>
+      </w:r>
+    </w:p>
+    <w:p>
+      <w:pPr>
+        <w:spacing w:before="120"/>
+      </w:pPr>
+      <w:r>
+        <w:rPr>
+          <w:rFonts w:ascii="Arial" w:hAnsi="Arial" w:cs="Arial"/>
+          <w:sz w:val="24"/>
+          <w:sz-cs w:val="24"/>
+          <w:vertAlign w:val="superscript"/>
+        </w:rPr>
+        <w:t xml:space="preserve">8</w:t>
+      </w:r>
+      <w:r>
+        <w:rPr>
+          <w:rFonts w:ascii="Arial" w:hAnsi="Arial" w:cs="Arial"/>
+          <w:sz w:val="24"/>
+          <w:sz-cs w:val="24"/>
+        </w:rPr>
+        <w:t xml:space="preserve"> Chỉ kê khai trong trường hợp thành lập mới. Doanh nghiệp căn cứ vào quy định của pháp luật về thuế giá trị gia tăng và dự kiến hoạt động kinh doanh của doanh nghiệp để xác định 01 trong 04 phương pháp tính thuế giá trị gia tăng tại chỉ tiêu này, trừ trường hợp doanh nghiệp mua bán, chế tác vàng, bạc, đá quý có thể chọn thêm phương pháp trực tiếp trên GTGT ngoài các phương pháp khác (</w:t>
+      </w:r>
+      <w:r>
+        <w:rPr>
+          <w:rFonts w:ascii="Arial" w:hAnsi="Arial" w:cs="Arial"/>
+          <w:sz w:val="24"/>
+          <w:sz-cs w:val="24"/>
+          <w:i/>
+        </w:rPr>
+        <w:t xml:space="preserve">nếu có</w:t>
+      </w:r>
+      <w:r>
+        <w:rPr>
+          <w:rFonts w:ascii="Arial" w:hAnsi="Arial" w:cs="Arial"/>
+          <w:sz w:val="24"/>
+          <w:sz-cs w:val="24"/>
+        </w:rPr>
+        <w:t xml:space="preserve">).</w:t>
+      </w:r>
+    </w:p>
+    <w:p>
+      <w:pPr>
+        <w:spacing w:before="120"/>
+      </w:pPr>
+      <w:r>
+        <w:rPr>
+          <w:rFonts w:ascii="Arial" w:hAnsi="Arial" w:cs="Arial"/>
+          <w:sz w:val="24"/>
+          <w:sz-cs w:val="24"/>
+          <w:vertAlign w:val="superscript"/>
+        </w:rPr>
+        <w:t xml:space="preserve">9 </w:t>
+      </w:r>
+      <w:r>
+        <w:rPr>
+          <w:rFonts w:ascii="Arial" w:hAnsi="Arial" w:cs="Arial"/>
+          <w:sz w:val="24"/>
+          <w:sz-cs w:val="24"/>
+        </w:rPr>
+        <w:t xml:space="preserve">Không kê khai trong trường hợp thành lập doanh nghiệp trên cơ sở chuyển đổi loại hình doanh nghiệp.</w:t>
+      </w:r>
+      <w:r>
+        <w:rPr>
+          <w:rFonts w:ascii="Arial" w:hAnsi="Arial" w:cs="Arial"/>
+          <w:sz w:val="24"/>
+          <w:sz-cs w:val="24"/>
+          <w:vertAlign w:val="superscript"/>
+        </w:rPr>
+        <w:t xml:space="preserve"/>
+      </w:r>
+    </w:p>
+    <w:p>
+      <w:pPr>
+        <w:spacing w:before="120"/>
+      </w:pPr>
+      <w:r>
+        <w:rPr>
+          <w:rFonts w:ascii="Arial" w:hAnsi="Arial" w:cs="Arial"/>
+          <w:sz w:val="24"/>
+          <w:sz-cs w:val="24"/>
+          <w:vertAlign w:val="superscript"/>
+        </w:rPr>
+        <w:t xml:space="preserve">10 </w:t>
+      </w:r>
+      <w:r>
+        <w:rPr>
+          <w:rFonts w:ascii="Arial" w:hAnsi="Arial" w:cs="Arial"/>
+          <w:sz w:val="24"/>
+          <w:sz-cs w:val="24"/>
+        </w:rPr>
+        <w:t xml:space="preserve">Trường hợp doanh nghiệp có thông tin về chủ sở hữu hưởng lợi của doanh nghiệp quy định tại khoản 1, khoản 2 Điều 18 Nghị định số 168/2025/NĐ-CP thì kê khai theo Mẫu số 10 Phụ lục I ban hành kèm theo Thông tư này.</w:t>
+      </w:r>
+    </w:p>
+    <w:p>
+      <w:pPr>
+        <w:spacing w:before="120"/>
+      </w:pPr>
+      <w:r>
+        <w:rPr>
+          <w:rFonts w:ascii="Arial" w:hAnsi="Arial" w:cs="Arial"/>
+          <w:sz w:val="24"/>
+          <w:sz-cs w:val="24"/>
+          <w:vertAlign w:val="superscript"/>
+        </w:rPr>
+        <w:t xml:space="preserve">11</w:t>
+      </w:r>
+      <w:r>
+        <w:rPr>
+          <w:rFonts w:ascii="Arial" w:hAnsi="Arial" w:cs="Arial"/>
+          <w:sz w:val="24"/>
+          <w:sz-cs w:val="24"/>
+        </w:rPr>
+        <w:t xml:space="preserve"> - Người đại diện theo pháp luật của doanh nghiệp ký trực tiếp vào phần này. </w:t>
+      </w:r>
+    </w:p>
+    <w:p>
+      <w:pPr>
+        <w:spacing w:before="120"/>
+      </w:pPr>
+      <w:r>
+        <w:rPr>
+          <w:rFonts w:ascii="Arial" w:hAnsi="Arial" w:cs="Arial"/>
+          <w:sz w:val="24"/>
+          <w:sz-cs w:val="24"/>
+        </w:rPr>
+        <w:t xml:space="preserve">- Trường hợp đăng ký chuyển đổi loại hình doanh nghiệp đồng thời đăng ký thay đổi người đại diện theo pháp luật thì Chủ tịch Hội đồng thành viên của công ty sau chuyển đổi ký trực tiếp vào phần này.</w:t>
+      </w:r>
+    </w:p>
+    <w:p>
+      <w:pPr>
+        <w:spacing w:before="120"/>
+      </w:pPr>
+      <w:r>
+        <w:rPr>
+          <w:rFonts w:ascii="Arial" w:hAnsi="Arial" w:cs="Arial"/>
+          <w:sz w:val="24"/>
+          <w:sz-cs w:val="24"/>
+          <w:b/>
+        </w:rPr>
+        <w:t xml:space="preserve"/>
       </w:r>
     </w:p>
     <w:sectPr>

</xml_diff>